<commit_message>
Reframe as online-only 360 digital services provider
Remove offline/physical-media services (OOH, print, retail, field, in-store, packaging) and reframe the framework around an all-digital, single-funnel model. Renamed 05 to digital-channel-strategy, updated ecosystem/KPI/team/operating-model docs and positioning, and regenerated the Google Docs .docx.
</commit_message>
<xml_diff>
--- a/360-growth-framework/google-docs/360-Growth-Framework.docx
+++ b/360-growth-framework/google-docs/360-Growth-Framework.docx
@@ -12,7 +12,7 @@
     </w:p>
     <w:p>
       <w:r>
-        <w:t xml:space="preserve">A complete operating model for a full-service business solutions provider that helps clients launch, build, operate, market, digitize, optimize, and scale across both online and offline channels. This framework positions the firm not as a vendor of one-off services, but as a long-term business growth partner that walks with the client through every phase of their lifecycle.</w:t>
+        <w:t xml:space="preserve">A complete operating model for an online-only 360° digital services provider that helps clients launch, build, market, digitize, optimize, and scale across the full digital landscape (web, e-commerce, search, social, content, paid media, email, automation, and data). This framework positions the firm not as a vendor of one-off services, but as a long-term digital growth partner that walks with the client through every phase of their lifecycle. Every capability here is delivered digitally; we do not provide offline or physical-media services (no out-of-home, print, retail, or field activation).</w:t>
       </w:r>
     </w:p>
     <w:p>
@@ -92,7 +92,7 @@
         <w:spacing w:after="60"/>
       </w:pPr>
       <w:r>
-        <w:t xml:space="preserve">Part 6 — Online + Offline Strategy Alignment</w:t>
+        <w:t xml:space="preserve">Part 6 — Digital Channel &amp; Funnel Strategy</w:t>
       </w:r>
     </w:p>
     <w:p>
@@ -1972,7 +1972,7 @@
         <w:spacing w:after="60"/>
       </w:pPr>
       <w:r>
-        <w:t xml:space="preserve">Online and offline are one strategy, not two budgets. Awareness, trust, and conversion are orchestrated across both worlds.</w:t>
+        <w:t xml:space="preserve">Every digital channel is one connected strategy, not separate silos. Search, social, content, paid media, email, and on-site experience are orchestrated as a single funnel with one set of numbers.</w:t>
       </w:r>
     </w:p>
     <w:p>
@@ -2507,7 +2507,7 @@
               <w:spacing w:after="0"/>
             </w:pPr>
             <w:r>
-              <w:t xml:space="preserve">Full brand identity (logo, guidelines, packaging, messaging, tone), company assets, operational framework, legal setup, digital infrastructure.</w:t>
+              <w:t xml:space="preserve">Full brand identity (logo, guidelines, visual system, messaging, tone), company assets, operational framework, legal setup via compliance partners, digital infrastructure.</w:t>
             </w:r>
           </w:p>
         </w:tc>
@@ -2943,7 +2943,7 @@
               <w:spacing w:after="0"/>
             </w:pPr>
             <w:r>
-              <w:t xml:space="preserve">Launch campaign, advertising, PR strategy, influencer collaborations, sales activation.</w:t>
+              <w:t xml:space="preserve">Launch campaign, paid advertising, digital PR strategy, influencer collaborations, sales activation.</w:t>
             </w:r>
           </w:p>
         </w:tc>
@@ -2999,7 +2999,7 @@
               <w:spacing w:after="0"/>
             </w:pPr>
             <w:r>
-              <w:t xml:space="preserve">Public Relations (media outreach, press, events), Offline Marketing (outdoor, print, retail branding, activations), Automation (lead nurture).</w:t>
+              <w:t xml:space="preserve">Digital PR &amp; Influencer (online media outreach, podcasts, creator collaborations), Marketplaces &amp; Affiliate (channel reach), Automation (lead nurture).</w:t>
             </w:r>
           </w:p>
         </w:tc>
@@ -4469,7 +4469,7 @@
               <w:spacing w:after="0"/>
             </w:pPr>
             <w:r>
-              <w:t xml:space="preserve">Identity, guidelines, packaging</w:t>
+              <w:t xml:space="preserve">Identity, guidelines, design system</w:t>
             </w:r>
           </w:p>
         </w:tc>
@@ -6937,7 +6937,7 @@
               <w:spacing w:after="0"/>
             </w:pPr>
             <w:r>
-              <w:t xml:space="preserve">Launch campaign ($$$), paid media management (retainer plus % of spend), influencer/PR ($$ to $$$), offline launch ($$ to $$$), sales enablement ($$)</w:t>
+              <w:t xml:space="preserve">Launch campaign ($$$), paid media management (retainer plus % of spend), influencer/PR ($$ to $$$), marketplace &amp; affiliate launch ($$), sales enablement ($$)</w:t>
             </w:r>
           </w:p>
         </w:tc>
@@ -7437,12 +7437,12 @@
         <w:pStyle w:val="Heading1"/>
       </w:pPr>
       <w:r>
-        <w:t xml:space="preserve">Part 6 — Online + Offline Strategy Alignment</w:t>
-      </w:r>
-    </w:p>
-    <w:p>
-      <w:r>
-        <w:t xml:space="preserve">A true 360° partner does not run "digital" and "traditional" as separate teams with separate budgets and separate reports. It is one customer, one journey, one funnel, one measurement model, expressed across both online and offline channels.</w:t>
+        <w:t xml:space="preserve">Part 6 — Digital Channel &amp; Funnel Strategy</w:t>
+      </w:r>
+    </w:p>
+    <w:p>
+      <w:r>
+        <w:t xml:space="preserve">As an online-only 360° digital provider, our edge is not "we run ads." It is that we orchestrate every digital channel as one customer, one journey, one funnel, one measurement model — instead of letting SEO, paid, social, email, and on-site experience run as disconnected silos with their own budgets and their own vanity reports.</w:t>
       </w:r>
     </w:p>
     <w:p>
@@ -7450,12 +7450,12 @@
         <w:pStyle w:val="Heading2"/>
       </w:pPr>
       <w:r>
-        <w:t xml:space="preserve">The guiding principle: O2O (online-to-offline and back)</w:t>
-      </w:r>
-    </w:p>
-    <w:p>
-      <w:r>
-        <w:t xml:space="preserve">The customer does not think in channels. They research online, buy in-store, get support on chat, and post a review on social. The journey loops: Discover (search/SEO, social, billboards/print, word of mouth/events), then Consider (website, reviews/reputation, store visit/showroom), then Convert (online checkout, in-store POS, sales rep), then Keep &amp; Grow (email/SMS, loyalty, support, community), and back to Discover. Every touchpoint — online or offline — writes into the same customer profile so the journey is continuous and measurable.</w:t>
+        <w:t xml:space="preserve">The guiding principle: one funnel, every channel</w:t>
+      </w:r>
+    </w:p>
+    <w:p>
+      <w:r>
+        <w:t xml:space="preserve">The customer does not think in channels. They discover a brand on social, search it, read reviews, get retargeted, buy on the site, and get nurtured by email. The journey loops: Awareness (SEO/content, paid social, paid search, video, organic social, digital PR/influencer), then Consideration (website/app, retargeting, reviews/reputation, email capture), then Conversion (e-commerce checkout, landing pages/CRO, marketplaces), then Retention &amp; Advocacy (email/SMS, loyalty/referrals, support, online community), and back to Awareness. Every touchpoint writes into the same customer profile — stitched by pixels, UTMs, and CRM IDs — so the journey is continuous, attributable, and optimizable.</w:t>
       </w:r>
     </w:p>
     <w:p>
@@ -7463,490 +7463,7 @@
         <w:pStyle w:val="Heading2"/>
       </w:pPr>
       <w:r>
-        <w:t xml:space="preserve">Online plus offline by lifecycle phase</w:t>
-      </w:r>
-    </w:p>
-    <w:tbl>
-      <w:tblPr>
-        <w:tblW w:w="9360" w:type="dxa"/>
-        <w:tblLayout w:type="fixed"/>
-        <w:tblBorders>
-          <w:top w:val="single" w:sz="4" w:space="0" w:color="BFBFBF"/>
-          <w:left w:val="single" w:sz="4" w:space="0" w:color="BFBFBF"/>
-          <w:bottom w:val="single" w:sz="4" w:space="0" w:color="BFBFBF"/>
-          <w:right w:val="single" w:sz="4" w:space="0" w:color="BFBFBF"/>
-          <w:insideH w:val="single" w:sz="4" w:space="0" w:color="BFBFBF"/>
-          <w:insideV w:val="single" w:sz="4" w:space="0" w:color="BFBFBF"/>
-        </w:tblBorders>
-        <w:tblLook w:val="04A0" w:firstRow="1" w:lastRow="0" w:firstColumn="0" w:lastColumn="0" w:noHBand="0" w:noVBand="1"/>
-      </w:tblPr>
-      <w:tblGrid>
-        <w:gridCol w:w="2340"/>
-        <w:gridCol w:w="2340"/>
-        <w:gridCol w:w="2340"/>
-        <w:gridCol w:w="2340"/>
-      </w:tblGrid>
-      <w:tr>
-        <w:tc>
-          <w:tcPr>
-            <w:tcW w:w="2340" w:type="dxa"/>
-            <w:shd w:val="clear" w:color="auto" w:fill="D9E2F3"/>
-          </w:tcPr>
-          <w:p>
-            <w:pPr>
-              <w:spacing w:after="0"/>
-            </w:pPr>
-            <w:r>
-              <w:rPr>
-                <w:b/>
-              </w:rPr>
-              <w:t xml:space="preserve">Phase</w:t>
-            </w:r>
-          </w:p>
-        </w:tc>
-        <w:tc>
-          <w:tcPr>
-            <w:tcW w:w="2340" w:type="dxa"/>
-            <w:shd w:val="clear" w:color="auto" w:fill="D9E2F3"/>
-          </w:tcPr>
-          <w:p>
-            <w:pPr>
-              <w:spacing w:after="0"/>
-            </w:pPr>
-            <w:r>
-              <w:rPr>
-                <w:b/>
-              </w:rPr>
-              <w:t xml:space="preserve">Online plays</w:t>
-            </w:r>
-          </w:p>
-        </w:tc>
-        <w:tc>
-          <w:tcPr>
-            <w:tcW w:w="2340" w:type="dxa"/>
-            <w:shd w:val="clear" w:color="auto" w:fill="D9E2F3"/>
-          </w:tcPr>
-          <w:p>
-            <w:pPr>
-              <w:spacing w:after="0"/>
-            </w:pPr>
-            <w:r>
-              <w:rPr>
-                <w:b/>
-              </w:rPr>
-              <w:t xml:space="preserve">Offline plays</w:t>
-            </w:r>
-          </w:p>
-        </w:tc>
-        <w:tc>
-          <w:tcPr>
-            <w:tcW w:w="2340" w:type="dxa"/>
-            <w:shd w:val="clear" w:color="auto" w:fill="D9E2F3"/>
-          </w:tcPr>
-          <w:p>
-            <w:pPr>
-              <w:spacing w:after="0"/>
-            </w:pPr>
-            <w:r>
-              <w:rPr>
-                <w:b/>
-              </w:rPr>
-              <w:t xml:space="preserve">The bridge</w:t>
-            </w:r>
-          </w:p>
-        </w:tc>
-      </w:tr>
-      <w:tr>
-        <w:tc>
-          <w:tcPr>
-            <w:tcW w:w="2340" w:type="dxa"/>
-          </w:tcPr>
-          <w:p>
-            <w:pPr>
-              <w:spacing w:after="0"/>
-            </w:pPr>
-            <w:r>
-              <w:t xml:space="preserve">1 Discovery</w:t>
-            </w:r>
-          </w:p>
-        </w:tc>
-        <w:tc>
-          <w:tcPr>
-            <w:tcW w:w="2340" w:type="dxa"/>
-          </w:tcPr>
-          <w:p>
-            <w:pPr>
-              <w:spacing w:after="0"/>
-            </w:pPr>
-            <w:r>
-              <w:t xml:space="preserve">Search trends, social listening, digital competitor scan</w:t>
-            </w:r>
-          </w:p>
-        </w:tc>
-        <w:tc>
-          <w:tcPr>
-            <w:tcW w:w="2340" w:type="dxa"/>
-          </w:tcPr>
-          <w:p>
-            <w:pPr>
-              <w:spacing w:after="0"/>
-            </w:pPr>
-            <w:r>
-              <w:t xml:space="preserve">Field interviews, focus groups, retail audits</w:t>
-            </w:r>
-          </w:p>
-        </w:tc>
-        <w:tc>
-          <w:tcPr>
-            <w:tcW w:w="2340" w:type="dxa"/>
-          </w:tcPr>
-          <w:p>
-            <w:pPr>
-              <w:spacing w:after="0"/>
-            </w:pPr>
-            <w:r>
-              <w:t xml:space="preserve">Combine digital demand data with on-the-ground insight</w:t>
-            </w:r>
-          </w:p>
-        </w:tc>
-      </w:tr>
-      <w:tr>
-        <w:tc>
-          <w:tcPr>
-            <w:tcW w:w="2340" w:type="dxa"/>
-          </w:tcPr>
-          <w:p>
-            <w:pPr>
-              <w:spacing w:after="0"/>
-            </w:pPr>
-            <w:r>
-              <w:t xml:space="preserve">2 Foundation</w:t>
-            </w:r>
-          </w:p>
-        </w:tc>
-        <w:tc>
-          <w:tcPr>
-            <w:tcW w:w="2340" w:type="dxa"/>
-          </w:tcPr>
-          <w:p>
-            <w:pPr>
-              <w:spacing w:after="0"/>
-            </w:pPr>
-            <w:r>
-              <w:t xml:space="preserve">Domain, digital brand assets, profiles</w:t>
-            </w:r>
-          </w:p>
-        </w:tc>
-        <w:tc>
-          <w:tcPr>
-            <w:tcW w:w="2340" w:type="dxa"/>
-          </w:tcPr>
-          <w:p>
-            <w:pPr>
-              <w:spacing w:after="0"/>
-            </w:pPr>
-            <w:r>
-              <w:t xml:space="preserve">Printed identity, signage, packaging, cards</w:t>
-            </w:r>
-          </w:p>
-        </w:tc>
-        <w:tc>
-          <w:tcPr>
-            <w:tcW w:w="2340" w:type="dxa"/>
-          </w:tcPr>
-          <w:p>
-            <w:pPr>
-              <w:spacing w:after="0"/>
-            </w:pPr>
-            <w:r>
-              <w:t xml:space="preserve">One brand system applied to pixels and print</w:t>
-            </w:r>
-          </w:p>
-        </w:tc>
-      </w:tr>
-      <w:tr>
-        <w:tc>
-          <w:tcPr>
-            <w:tcW w:w="2340" w:type="dxa"/>
-          </w:tcPr>
-          <w:p>
-            <w:pPr>
-              <w:spacing w:after="0"/>
-            </w:pPr>
-            <w:r>
-              <w:t xml:space="preserve">3 Digital</w:t>
-            </w:r>
-          </w:p>
-        </w:tc>
-        <w:tc>
-          <w:tcPr>
-            <w:tcW w:w="2340" w:type="dxa"/>
-          </w:tcPr>
-          <w:p>
-            <w:pPr>
-              <w:spacing w:after="0"/>
-            </w:pPr>
-            <w:r>
-              <w:t xml:space="preserve">Website, e-comm, social, GBP</w:t>
-            </w:r>
-          </w:p>
-        </w:tc>
-        <w:tc>
-          <w:tcPr>
-            <w:tcW w:w="2340" w:type="dxa"/>
-          </w:tcPr>
-          <w:p>
-            <w:pPr>
-              <w:spacing w:after="0"/>
-            </w:pPr>
-            <w:r>
-              <w:t xml:space="preserve">Store/QR signage, printed collateral with URLs</w:t>
-            </w:r>
-          </w:p>
-        </w:tc>
-        <w:tc>
-          <w:tcPr>
-            <w:tcW w:w="2340" w:type="dxa"/>
-          </w:tcPr>
-          <w:p>
-            <w:pPr>
-              <w:spacing w:after="0"/>
-            </w:pPr>
-            <w:r>
-              <w:t xml:space="preserve">QR codes and "find us online" drive offline to online</w:t>
-            </w:r>
-          </w:p>
-        </w:tc>
-      </w:tr>
-      <w:tr>
-        <w:tc>
-          <w:tcPr>
-            <w:tcW w:w="2340" w:type="dxa"/>
-          </w:tcPr>
-          <w:p>
-            <w:pPr>
-              <w:spacing w:after="0"/>
-            </w:pPr>
-            <w:r>
-              <w:t xml:space="preserve">4 Launch</w:t>
-            </w:r>
-          </w:p>
-        </w:tc>
-        <w:tc>
-          <w:tcPr>
-            <w:tcW w:w="2340" w:type="dxa"/>
-          </w:tcPr>
-          <w:p>
-            <w:pPr>
-              <w:spacing w:after="0"/>
-            </w:pPr>
-            <w:r>
-              <w:t xml:space="preserve">Paid social/search, influencers, email</w:t>
-            </w:r>
-          </w:p>
-        </w:tc>
-        <w:tc>
-          <w:tcPr>
-            <w:tcW w:w="2340" w:type="dxa"/>
-          </w:tcPr>
-          <w:p>
-            <w:pPr>
-              <w:spacing w:after="0"/>
-            </w:pPr>
-            <w:r>
-              <w:t xml:space="preserve">Events, OOH, flyers, retail activations, PR</w:t>
-            </w:r>
-          </w:p>
-        </w:tc>
-        <w:tc>
-          <w:tcPr>
-            <w:tcW w:w="2340" w:type="dxa"/>
-          </w:tcPr>
-          <w:p>
-            <w:pPr>
-              <w:spacing w:after="0"/>
-            </w:pPr>
-            <w:r>
-              <w:t xml:space="preserve">Trackable promo codes plus UTM'd QR codes tie offline to the funnel</w:t>
-            </w:r>
-          </w:p>
-        </w:tc>
-      </w:tr>
-      <w:tr>
-        <w:tc>
-          <w:tcPr>
-            <w:tcW w:w="2340" w:type="dxa"/>
-          </w:tcPr>
-          <w:p>
-            <w:pPr>
-              <w:spacing w:after="0"/>
-            </w:pPr>
-            <w:r>
-              <w:t xml:space="preserve">5 Operate/Retain</w:t>
-            </w:r>
-          </w:p>
-        </w:tc>
-        <w:tc>
-          <w:tcPr>
-            <w:tcW w:w="2340" w:type="dxa"/>
-          </w:tcPr>
-          <w:p>
-            <w:pPr>
-              <w:spacing w:after="0"/>
-            </w:pPr>
-            <w:r>
-              <w:t xml:space="preserve">Lifecycle email/SMS, online support, reviews</w:t>
-            </w:r>
-          </w:p>
-        </w:tc>
-        <w:tc>
-          <w:tcPr>
-            <w:tcW w:w="2340" w:type="dxa"/>
-          </w:tcPr>
-          <w:p>
-            <w:pPr>
-              <w:spacing w:after="0"/>
-            </w:pPr>
-            <w:r>
-              <w:t xml:space="preserve">In-store loyalty, packaging inserts, community events</w:t>
-            </w:r>
-          </w:p>
-        </w:tc>
-        <w:tc>
-          <w:tcPr>
-            <w:tcW w:w="2340" w:type="dxa"/>
-          </w:tcPr>
-          <w:p>
-            <w:pPr>
-              <w:spacing w:after="0"/>
-            </w:pPr>
-            <w:r>
-              <w:t xml:space="preserve">Loyalty ID unifies online and offline purchases</w:t>
-            </w:r>
-          </w:p>
-        </w:tc>
-      </w:tr>
-      <w:tr>
-        <w:tc>
-          <w:tcPr>
-            <w:tcW w:w="2340" w:type="dxa"/>
-          </w:tcPr>
-          <w:p>
-            <w:pPr>
-              <w:spacing w:after="0"/>
-            </w:pPr>
-            <w:r>
-              <w:t xml:space="preserve">6 Scale</w:t>
-            </w:r>
-          </w:p>
-        </w:tc>
-        <w:tc>
-          <w:tcPr>
-            <w:tcW w:w="2340" w:type="dxa"/>
-          </w:tcPr>
-          <w:p>
-            <w:pPr>
-              <w:spacing w:after="0"/>
-            </w:pPr>
-            <w:r>
-              <w:t xml:space="preserve">Omnichannel paid, marketplaces, new geos online</w:t>
-            </w:r>
-          </w:p>
-        </w:tc>
-        <w:tc>
-          <w:tcPr>
-            <w:tcW w:w="2340" w:type="dxa"/>
-          </w:tcPr>
-          <w:p>
-            <w:pPr>
-              <w:spacing w:after="0"/>
-            </w:pPr>
-            <w:r>
-              <w:t xml:space="preserve">New locations, franchise, distribution, trade shows</w:t>
-            </w:r>
-          </w:p>
-        </w:tc>
-        <w:tc>
-          <w:tcPr>
-            <w:tcW w:w="2340" w:type="dxa"/>
-          </w:tcPr>
-          <w:p>
-            <w:pPr>
-              <w:spacing w:after="0"/>
-            </w:pPr>
-            <w:r>
-              <w:t xml:space="preserve">Central data shows which channel mix wins per market</w:t>
-            </w:r>
-          </w:p>
-        </w:tc>
-      </w:tr>
-      <w:tr>
-        <w:tc>
-          <w:tcPr>
-            <w:tcW w:w="2340" w:type="dxa"/>
-          </w:tcPr>
-          <w:p>
-            <w:pPr>
-              <w:spacing w:after="0"/>
-            </w:pPr>
-            <w:r>
-              <w:t xml:space="preserve">7 Transform</w:t>
-            </w:r>
-          </w:p>
-        </w:tc>
-        <w:tc>
-          <w:tcPr>
-            <w:tcW w:w="2340" w:type="dxa"/>
-          </w:tcPr>
-          <w:p>
-            <w:pPr>
-              <w:spacing w:after="0"/>
-            </w:pPr>
-            <w:r>
-              <w:t xml:space="preserve">AI personalization, predictive media</w:t>
-            </w:r>
-          </w:p>
-        </w:tc>
-        <w:tc>
-          <w:tcPr>
-            <w:tcW w:w="2340" w:type="dxa"/>
-          </w:tcPr>
-          <w:p>
-            <w:pPr>
-              <w:spacing w:after="0"/>
-            </w:pPr>
-            <w:r>
-              <w:t xml:space="preserve">Experiential retail, flagship experiences</w:t>
-            </w:r>
-          </w:p>
-        </w:tc>
-        <w:tc>
-          <w:tcPr>
-            <w:tcW w:w="2340" w:type="dxa"/>
-          </w:tcPr>
-          <w:p>
-            <w:pPr>
-              <w:spacing w:after="0"/>
-            </w:pPr>
-            <w:r>
-              <w:t xml:space="preserve">Unified profile powers personalization everywhere</w:t>
-            </w:r>
-          </w:p>
-        </w:tc>
-      </w:tr>
-    </w:tbl>
-    <w:p/>
-    <w:p>
-      <w:pPr>
-        <w:pStyle w:val="Heading2"/>
-      </w:pPr>
-      <w:r>
-        <w:t xml:space="preserve">The bridge mechanisms</w:t>
-      </w:r>
-    </w:p>
-    <w:p>
-      <w:r>
-        <w:t xml:space="preserve">These concrete tools connect offline to online so the funnel stays unbroken and attributable. Rule: no offline tactic ships without a tracking bridge.</w:t>
+        <w:t xml:space="preserve">Channels by lifecycle phase</w:t>
       </w:r>
     </w:p>
     <w:tbl>
@@ -7982,7 +7499,7 @@
               <w:rPr>
                 <w:b/>
               </w:rPr>
-              <w:t xml:space="preserve">Mechanism</w:t>
+              <w:t xml:space="preserve">Phase</w:t>
             </w:r>
           </w:p>
         </w:tc>
@@ -7999,7 +7516,7 @@
               <w:rPr>
                 <w:b/>
               </w:rPr>
-              <w:t xml:space="preserve">Connects</w:t>
+              <w:t xml:space="preserve">Channel emphasis</w:t>
             </w:r>
           </w:p>
         </w:tc>
@@ -8016,294 +7533,294 @@
               <w:rPr>
                 <w:b/>
               </w:rPr>
-              <w:t xml:space="preserve">What it enables</w:t>
-            </w:r>
-          </w:p>
-        </w:tc>
-      </w:tr>
-      <w:tr>
-        <w:tc>
-          <w:tcPr>
-            <w:tcW w:w="3120" w:type="dxa"/>
-          </w:tcPr>
-          <w:p>
-            <w:pPr>
-              <w:spacing w:after="0"/>
-            </w:pPr>
-            <w:r>
-              <w:t xml:space="preserve">QR codes (UTM-tagged)</w:t>
-            </w:r>
-          </w:p>
-        </w:tc>
-        <w:tc>
-          <w:tcPr>
-            <w:tcW w:w="3120" w:type="dxa"/>
-          </w:tcPr>
-          <w:p>
-            <w:pPr>
-              <w:spacing w:after="0"/>
-            </w:pPr>
-            <w:r>
-              <w:t xml:space="preserve">Print/OOH/retail to website</w:t>
-            </w:r>
-          </w:p>
-        </w:tc>
-        <w:tc>
-          <w:tcPr>
-            <w:tcW w:w="3120" w:type="dxa"/>
-          </w:tcPr>
-          <w:p>
-            <w:pPr>
-              <w:spacing w:after="0"/>
-            </w:pPr>
-            <w:r>
-              <w:t xml:space="preserve">Attribute offline media to online actions</w:t>
-            </w:r>
-          </w:p>
-        </w:tc>
-      </w:tr>
-      <w:tr>
-        <w:tc>
-          <w:tcPr>
-            <w:tcW w:w="3120" w:type="dxa"/>
-          </w:tcPr>
-          <w:p>
-            <w:pPr>
-              <w:spacing w:after="0"/>
-            </w:pPr>
-            <w:r>
-              <w:t xml:space="preserve">Promo / discount codes</w:t>
-            </w:r>
-          </w:p>
-        </w:tc>
-        <w:tc>
-          <w:tcPr>
-            <w:tcW w:w="3120" w:type="dxa"/>
-          </w:tcPr>
-          <w:p>
-            <w:pPr>
-              <w:spacing w:after="0"/>
-            </w:pPr>
-            <w:r>
-              <w:t xml:space="preserve">Events/flyers/influencers to checkout</w:t>
-            </w:r>
-          </w:p>
-        </w:tc>
-        <w:tc>
-          <w:tcPr>
-            <w:tcW w:w="3120" w:type="dxa"/>
-          </w:tcPr>
-          <w:p>
-            <w:pPr>
-              <w:spacing w:after="0"/>
-            </w:pPr>
-            <w:r>
-              <w:t xml:space="preserve">Track which offline source drove the sale</w:t>
-            </w:r>
-          </w:p>
-        </w:tc>
-      </w:tr>
-      <w:tr>
-        <w:tc>
-          <w:tcPr>
-            <w:tcW w:w="3120" w:type="dxa"/>
-          </w:tcPr>
-          <w:p>
-            <w:pPr>
-              <w:spacing w:after="0"/>
-            </w:pPr>
-            <w:r>
-              <w:t xml:space="preserve">Loyalty ID / phone / email</w:t>
-            </w:r>
-          </w:p>
-        </w:tc>
-        <w:tc>
-          <w:tcPr>
-            <w:tcW w:w="3120" w:type="dxa"/>
-          </w:tcPr>
-          <w:p>
-            <w:pPr>
-              <w:spacing w:after="0"/>
-            </w:pPr>
-            <w:r>
-              <w:t xml:space="preserve">In-store to CRM profile</w:t>
-            </w:r>
-          </w:p>
-        </w:tc>
-        <w:tc>
-          <w:tcPr>
-            <w:tcW w:w="3120" w:type="dxa"/>
-          </w:tcPr>
-          <w:p>
-            <w:pPr>
-              <w:spacing w:after="0"/>
-            </w:pPr>
-            <w:r>
-              <w:t xml:space="preserve">Unify online and offline purchase history</w:t>
-            </w:r>
-          </w:p>
-        </w:tc>
-      </w:tr>
-      <w:tr>
-        <w:tc>
-          <w:tcPr>
-            <w:tcW w:w="3120" w:type="dxa"/>
-          </w:tcPr>
-          <w:p>
-            <w:pPr>
-              <w:spacing w:after="0"/>
-            </w:pPr>
-            <w:r>
-              <w:t xml:space="preserve">Reserve online, pick up in store</w:t>
-            </w:r>
-          </w:p>
-        </w:tc>
-        <w:tc>
-          <w:tcPr>
-            <w:tcW w:w="3120" w:type="dxa"/>
-          </w:tcPr>
-          <w:p>
-            <w:pPr>
-              <w:spacing w:after="0"/>
-            </w:pPr>
-            <w:r>
-              <w:t xml:space="preserve">Online to offline footfall</w:t>
-            </w:r>
-          </w:p>
-        </w:tc>
-        <w:tc>
-          <w:tcPr>
-            <w:tcW w:w="3120" w:type="dxa"/>
-          </w:tcPr>
-          <w:p>
-            <w:pPr>
-              <w:spacing w:after="0"/>
-            </w:pPr>
-            <w:r>
-              <w:t xml:space="preserve">Convert digital intent to store visits</w:t>
-            </w:r>
-          </w:p>
-        </w:tc>
-      </w:tr>
-      <w:tr>
-        <w:tc>
-          <w:tcPr>
-            <w:tcW w:w="3120" w:type="dxa"/>
-          </w:tcPr>
-          <w:p>
-            <w:pPr>
-              <w:spacing w:after="0"/>
-            </w:pPr>
-            <w:r>
-              <w:t xml:space="preserve">Trackable call numbers</w:t>
-            </w:r>
-          </w:p>
-        </w:tc>
-        <w:tc>
-          <w:tcPr>
-            <w:tcW w:w="3120" w:type="dxa"/>
-          </w:tcPr>
-          <w:p>
-            <w:pPr>
-              <w:spacing w:after="0"/>
-            </w:pPr>
-            <w:r>
-              <w:t xml:space="preserve">Print/OOH to phone sales</w:t>
-            </w:r>
-          </w:p>
-        </w:tc>
-        <w:tc>
-          <w:tcPr>
-            <w:tcW w:w="3120" w:type="dxa"/>
-          </w:tcPr>
-          <w:p>
-            <w:pPr>
-              <w:spacing w:after="0"/>
-            </w:pPr>
-            <w:r>
-              <w:t xml:space="preserve">Measure call-driven conversions</w:t>
-            </w:r>
-          </w:p>
-        </w:tc>
-      </w:tr>
-      <w:tr>
-        <w:tc>
-          <w:tcPr>
-            <w:tcW w:w="3120" w:type="dxa"/>
-          </w:tcPr>
-          <w:p>
-            <w:pPr>
-              <w:spacing w:after="0"/>
-            </w:pPr>
-            <w:r>
-              <w:t xml:space="preserve">Geo-targeted digital</w:t>
-            </w:r>
-          </w:p>
-        </w:tc>
-        <w:tc>
-          <w:tcPr>
-            <w:tcW w:w="3120" w:type="dxa"/>
-          </w:tcPr>
-          <w:p>
-            <w:pPr>
-              <w:spacing w:after="0"/>
-            </w:pPr>
-            <w:r>
-              <w:t xml:space="preserve">Online ads to local stores</w:t>
-            </w:r>
-          </w:p>
-        </w:tc>
-        <w:tc>
-          <w:tcPr>
-            <w:tcW w:w="3120" w:type="dxa"/>
-          </w:tcPr>
-          <w:p>
-            <w:pPr>
-              <w:spacing w:after="0"/>
-            </w:pPr>
-            <w:r>
-              <w:t xml:space="preserve">Drive footfall to specific locations</w:t>
-            </w:r>
-          </w:p>
-        </w:tc>
-      </w:tr>
-      <w:tr>
-        <w:tc>
-          <w:tcPr>
-            <w:tcW w:w="3120" w:type="dxa"/>
-          </w:tcPr>
-          <w:p>
-            <w:pPr>
-              <w:spacing w:after="0"/>
-            </w:pPr>
-            <w:r>
-              <w:t xml:space="preserve">Post-purchase QR on packaging</w:t>
-            </w:r>
-          </w:p>
-        </w:tc>
-        <w:tc>
-          <w:tcPr>
-            <w:tcW w:w="3120" w:type="dxa"/>
-          </w:tcPr>
-          <w:p>
-            <w:pPr>
-              <w:spacing w:after="0"/>
-            </w:pPr>
-            <w:r>
-              <w:t xml:space="preserve">Offline product to reviews/community</w:t>
-            </w:r>
-          </w:p>
-        </w:tc>
-        <w:tc>
-          <w:tcPr>
-            <w:tcW w:w="3120" w:type="dxa"/>
-          </w:tcPr>
-          <w:p>
-            <w:pPr>
-              <w:spacing w:after="0"/>
-            </w:pPr>
-            <w:r>
-              <w:t xml:space="preserve">Turn buyers into advocates and data</w:t>
+              <w:t xml:space="preserve">What we do</w:t>
+            </w:r>
+          </w:p>
+        </w:tc>
+      </w:tr>
+      <w:tr>
+        <w:tc>
+          <w:tcPr>
+            <w:tcW w:w="3120" w:type="dxa"/>
+          </w:tcPr>
+          <w:p>
+            <w:pPr>
+              <w:spacing w:after="0"/>
+            </w:pPr>
+            <w:r>
+              <w:t xml:space="preserve">1 Discovery</w:t>
+            </w:r>
+          </w:p>
+        </w:tc>
+        <w:tc>
+          <w:tcPr>
+            <w:tcW w:w="3120" w:type="dxa"/>
+          </w:tcPr>
+          <w:p>
+            <w:pPr>
+              <w:spacing w:after="0"/>
+            </w:pPr>
+            <w:r>
+              <w:t xml:space="preserve">Search &amp; social listening</w:t>
+            </w:r>
+          </w:p>
+        </w:tc>
+        <w:tc>
+          <w:tcPr>
+            <w:tcW w:w="3120" w:type="dxa"/>
+          </w:tcPr>
+          <w:p>
+            <w:pPr>
+              <w:spacing w:after="0"/>
+            </w:pPr>
+            <w:r>
+              <w:t xml:space="preserve">Keyword/demand research, social listening, digital competitor scan, SEO gap analysis</w:t>
+            </w:r>
+          </w:p>
+        </w:tc>
+      </w:tr>
+      <w:tr>
+        <w:tc>
+          <w:tcPr>
+            <w:tcW w:w="3120" w:type="dxa"/>
+          </w:tcPr>
+          <w:p>
+            <w:pPr>
+              <w:spacing w:after="0"/>
+            </w:pPr>
+            <w:r>
+              <w:t xml:space="preserve">2 Foundation</w:t>
+            </w:r>
+          </w:p>
+        </w:tc>
+        <w:tc>
+          <w:tcPr>
+            <w:tcW w:w="3120" w:type="dxa"/>
+          </w:tcPr>
+          <w:p>
+            <w:pPr>
+              <w:spacing w:after="0"/>
+            </w:pPr>
+            <w:r>
+              <w:t xml:space="preserve">Owned channels setup</w:t>
+            </w:r>
+          </w:p>
+        </w:tc>
+        <w:tc>
+          <w:tcPr>
+            <w:tcW w:w="3120" w:type="dxa"/>
+          </w:tcPr>
+          <w:p>
+            <w:pPr>
+              <w:spacing w:after="0"/>
+            </w:pPr>
+            <w:r>
+              <w:t xml:space="preserve">Domain, brand profiles, analytics, channel and content plan</w:t>
+            </w:r>
+          </w:p>
+        </w:tc>
+      </w:tr>
+      <w:tr>
+        <w:tc>
+          <w:tcPr>
+            <w:tcW w:w="3120" w:type="dxa"/>
+          </w:tcPr>
+          <w:p>
+            <w:pPr>
+              <w:spacing w:after="0"/>
+            </w:pPr>
+            <w:r>
+              <w:t xml:space="preserve">3 Digital</w:t>
+            </w:r>
+          </w:p>
+        </w:tc>
+        <w:tc>
+          <w:tcPr>
+            <w:tcW w:w="3120" w:type="dxa"/>
+          </w:tcPr>
+          <w:p>
+            <w:pPr>
+              <w:spacing w:after="0"/>
+            </w:pPr>
+            <w:r>
+              <w:t xml:space="preserve">Website, SEO, social, GBP</w:t>
+            </w:r>
+          </w:p>
+        </w:tc>
+        <w:tc>
+          <w:tcPr>
+            <w:tcW w:w="3120" w:type="dxa"/>
+          </w:tcPr>
+          <w:p>
+            <w:pPr>
+              <w:spacing w:after="0"/>
+            </w:pPr>
+            <w:r>
+              <w:t xml:space="preserve">Launch-ready site/store, SEO foundation, social presence, tracking</w:t>
+            </w:r>
+          </w:p>
+        </w:tc>
+      </w:tr>
+      <w:tr>
+        <w:tc>
+          <w:tcPr>
+            <w:tcW w:w="3120" w:type="dxa"/>
+          </w:tcPr>
+          <w:p>
+            <w:pPr>
+              <w:spacing w:after="0"/>
+            </w:pPr>
+            <w:r>
+              <w:t xml:space="preserve">4 Launch</w:t>
+            </w:r>
+          </w:p>
+        </w:tc>
+        <w:tc>
+          <w:tcPr>
+            <w:tcW w:w="3120" w:type="dxa"/>
+          </w:tcPr>
+          <w:p>
+            <w:pPr>
+              <w:spacing w:after="0"/>
+            </w:pPr>
+            <w:r>
+              <w:t xml:space="preserve">Paid social/search, influencer, email</w:t>
+            </w:r>
+          </w:p>
+        </w:tc>
+        <w:tc>
+          <w:tcPr>
+            <w:tcW w:w="3120" w:type="dxa"/>
+          </w:tcPr>
+          <w:p>
+            <w:pPr>
+              <w:spacing w:after="0"/>
+            </w:pPr>
+            <w:r>
+              <w:t xml:space="preserve">Launch campaigns, creator collabs, digital PR, lead capture</w:t>
+            </w:r>
+          </w:p>
+        </w:tc>
+      </w:tr>
+      <w:tr>
+        <w:tc>
+          <w:tcPr>
+            <w:tcW w:w="3120" w:type="dxa"/>
+          </w:tcPr>
+          <w:p>
+            <w:pPr>
+              <w:spacing w:after="0"/>
+            </w:pPr>
+            <w:r>
+              <w:t xml:space="preserve">5 Operate/Retain</w:t>
+            </w:r>
+          </w:p>
+        </w:tc>
+        <w:tc>
+          <w:tcPr>
+            <w:tcW w:w="3120" w:type="dxa"/>
+          </w:tcPr>
+          <w:p>
+            <w:pPr>
+              <w:spacing w:after="0"/>
+            </w:pPr>
+            <w:r>
+              <w:t xml:space="preserve">Email/SMS, retargeting, reviews, support</w:t>
+            </w:r>
+          </w:p>
+        </w:tc>
+        <w:tc>
+          <w:tcPr>
+            <w:tcW w:w="3120" w:type="dxa"/>
+          </w:tcPr>
+          <w:p>
+            <w:pPr>
+              <w:spacing w:after="0"/>
+            </w:pPr>
+            <w:r>
+              <w:t xml:space="preserve">Lifecycle automation, reputation, retargeting, support channels</w:t>
+            </w:r>
+          </w:p>
+        </w:tc>
+      </w:tr>
+      <w:tr>
+        <w:tc>
+          <w:tcPr>
+            <w:tcW w:w="3120" w:type="dxa"/>
+          </w:tcPr>
+          <w:p>
+            <w:pPr>
+              <w:spacing w:after="0"/>
+            </w:pPr>
+            <w:r>
+              <w:t xml:space="preserve">6 Scale</w:t>
+            </w:r>
+          </w:p>
+        </w:tc>
+        <w:tc>
+          <w:tcPr>
+            <w:tcW w:w="3120" w:type="dxa"/>
+          </w:tcPr>
+          <w:p>
+            <w:pPr>
+              <w:spacing w:after="0"/>
+            </w:pPr>
+            <w:r>
+              <w:t xml:space="preserve">Omnichannel paid, marketplaces, new geos</w:t>
+            </w:r>
+          </w:p>
+        </w:tc>
+        <w:tc>
+          <w:tcPr>
+            <w:tcW w:w="3120" w:type="dxa"/>
+          </w:tcPr>
+          <w:p>
+            <w:pPr>
+              <w:spacing w:after="0"/>
+            </w:pPr>
+            <w:r>
+              <w:t xml:space="preserve">Scale spend, add channels/marketplaces, expand to new digital markets</w:t>
+            </w:r>
+          </w:p>
+        </w:tc>
+      </w:tr>
+      <w:tr>
+        <w:tc>
+          <w:tcPr>
+            <w:tcW w:w="3120" w:type="dxa"/>
+          </w:tcPr>
+          <w:p>
+            <w:pPr>
+              <w:spacing w:after="0"/>
+            </w:pPr>
+            <w:r>
+              <w:t xml:space="preserve">7 Transform</w:t>
+            </w:r>
+          </w:p>
+        </w:tc>
+        <w:tc>
+          <w:tcPr>
+            <w:tcW w:w="3120" w:type="dxa"/>
+          </w:tcPr>
+          <w:p>
+            <w:pPr>
+              <w:spacing w:after="0"/>
+            </w:pPr>
+            <w:r>
+              <w:t xml:space="preserve">AI personalization, predictive media</w:t>
+            </w:r>
+          </w:p>
+        </w:tc>
+        <w:tc>
+          <w:tcPr>
+            <w:tcW w:w="3120" w:type="dxa"/>
+          </w:tcPr>
+          <w:p>
+            <w:pPr>
+              <w:spacing w:after="0"/>
+            </w:pPr>
+            <w:r>
+              <w:t xml:space="preserve">Predictive audiences, personalization, automated optimization</w:t>
             </w:r>
           </w:p>
         </w:tc>
@@ -8315,291 +7832,7 @@
         <w:pStyle w:val="Heading2"/>
       </w:pPr>
       <w:r>
-        <w:t xml:space="preserve">Budget allocation logic</w:t>
-      </w:r>
-    </w:p>
-    <w:p>
-      <w:r>
-        <w:t xml:space="preserve">Do not split budget by "digital versus traditional." Allocate by job-to-be-done and measured contribution: start with a balanced awareness/conversion split appropriate to the phase (early phases lean awareness; later phases lean conversion and retention); measure every channel's contribution to the unified funnel; reallocate monthly toward the channels (online or offline) with the best marginal return; and protect a fixed percent for brand/awareness so the funnel keeps filling. The 360° advantage is that because we run both worlds and measure them in one model, we can move budget to whatever works.</w:t>
-      </w:r>
-    </w:p>
-    <w:p>
-      <w:pPr>
-        <w:pStyle w:val="Heading1"/>
-      </w:pPr>
-      <w:r>
-        <w:t xml:space="preserve">Part 7 — Client Retention Model</w:t>
-      </w:r>
-    </w:p>
-    <w:p>
-      <w:r>
-        <w:t xml:space="preserve">Retention is the whole point. A 360° firm's enterprise value lives in recurring revenue and multi-year relationships. This model covers both retaining our clients and helping clients retain their customers. Both run on the same logic: deliver value, prove it, deepen the relationship, repeat.</w:t>
-      </w:r>
-    </w:p>
-    <w:p>
-      <w:pPr>
-        <w:pStyle w:val="Heading2"/>
-      </w:pPr>
-      <w:r>
-        <w:t xml:space="preserve">Retaining our clients — the retention ladder</w:t>
-      </w:r>
-    </w:p>
-    <w:p>
-      <w:r>
-        <w:t xml:space="preserve">The ladder climbs: Project buyer (one service), then Repeat buyer (more projects), then Retainer client (recurring), then Multi-service partner (several lines), then Growth partner (strategic, multi-year), then Advocate (referrals plus case study). Each rung increases retention, margin, and lifetime value. The account team's job is to move every client up the ladder.</w:t>
-      </w:r>
-    </w:p>
-    <w:p>
-      <w:pPr>
-        <w:pStyle w:val="Heading2"/>
-      </w:pPr>
-      <w:r>
-        <w:t xml:space="preserve">What drives agency retention</w:t>
-      </w:r>
-    </w:p>
-    <w:tbl>
-      <w:tblPr>
-        <w:tblW w:w="9360" w:type="dxa"/>
-        <w:tblLayout w:type="fixed"/>
-        <w:tblBorders>
-          <w:top w:val="single" w:sz="4" w:space="0" w:color="BFBFBF"/>
-          <w:left w:val="single" w:sz="4" w:space="0" w:color="BFBFBF"/>
-          <w:bottom w:val="single" w:sz="4" w:space="0" w:color="BFBFBF"/>
-          <w:right w:val="single" w:sz="4" w:space="0" w:color="BFBFBF"/>
-          <w:insideH w:val="single" w:sz="4" w:space="0" w:color="BFBFBF"/>
-          <w:insideV w:val="single" w:sz="4" w:space="0" w:color="BFBFBF"/>
-        </w:tblBorders>
-        <w:tblLook w:val="04A0" w:firstRow="1" w:lastRow="0" w:firstColumn="0" w:lastColumn="0" w:noHBand="0" w:noVBand="1"/>
-      </w:tblPr>
-      <w:tblGrid>
-        <w:gridCol w:w="4680"/>
-        <w:gridCol w:w="4680"/>
-      </w:tblGrid>
-      <w:tr>
-        <w:tc>
-          <w:tcPr>
-            <w:tcW w:w="4680" w:type="dxa"/>
-            <w:shd w:val="clear" w:color="auto" w:fill="D9E2F3"/>
-          </w:tcPr>
-          <w:p>
-            <w:pPr>
-              <w:spacing w:after="0"/>
-            </w:pPr>
-            <w:r>
-              <w:rPr>
-                <w:b/>
-              </w:rPr>
-              <w:t xml:space="preserve">Driver</w:t>
-            </w:r>
-          </w:p>
-        </w:tc>
-        <w:tc>
-          <w:tcPr>
-            <w:tcW w:w="4680" w:type="dxa"/>
-            <w:shd w:val="clear" w:color="auto" w:fill="D9E2F3"/>
-          </w:tcPr>
-          <w:p>
-            <w:pPr>
-              <w:spacing w:after="0"/>
-            </w:pPr>
-            <w:r>
-              <w:rPr>
-                <w:b/>
-              </w:rPr>
-              <w:t xml:space="preserve">How we operationalize it</w:t>
-            </w:r>
-          </w:p>
-        </w:tc>
-      </w:tr>
-      <w:tr>
-        <w:tc>
-          <w:tcPr>
-            <w:tcW w:w="4680" w:type="dxa"/>
-          </w:tcPr>
-          <w:p>
-            <w:pPr>
-              <w:spacing w:after="0"/>
-            </w:pPr>
-            <w:r>
-              <w:t xml:space="preserve">Proven ROI</w:t>
-            </w:r>
-          </w:p>
-        </w:tc>
-        <w:tc>
-          <w:tcPr>
-            <w:tcW w:w="4680" w:type="dxa"/>
-          </w:tcPr>
-          <w:p>
-            <w:pPr>
-              <w:spacing w:after="0"/>
-            </w:pPr>
-            <w:r>
-              <w:t xml:space="preserve">One shared dashboard that ties our work to the client's revenue</w:t>
-            </w:r>
-          </w:p>
-        </w:tc>
-      </w:tr>
-      <w:tr>
-        <w:tc>
-          <w:tcPr>
-            <w:tcW w:w="4680" w:type="dxa"/>
-          </w:tcPr>
-          <w:p>
-            <w:pPr>
-              <w:spacing w:after="0"/>
-            </w:pPr>
-            <w:r>
-              <w:t xml:space="preserve">Single relationship</w:t>
-            </w:r>
-          </w:p>
-        </w:tc>
-        <w:tc>
-          <w:tcPr>
-            <w:tcW w:w="4680" w:type="dxa"/>
-          </w:tcPr>
-          <w:p>
-            <w:pPr>
-              <w:spacing w:after="0"/>
-            </w:pPr>
-            <w:r>
-              <w:t xml:space="preserve">One account/growth-partner lead across all services</w:t>
-            </w:r>
-          </w:p>
-        </w:tc>
-      </w:tr>
-      <w:tr>
-        <w:tc>
-          <w:tcPr>
-            <w:tcW w:w="4680" w:type="dxa"/>
-          </w:tcPr>
-          <w:p>
-            <w:pPr>
-              <w:spacing w:after="0"/>
-            </w:pPr>
-            <w:r>
-              <w:t xml:space="preserve">Proactive roadmap</w:t>
-            </w:r>
-          </w:p>
-        </w:tc>
-        <w:tc>
-          <w:tcPr>
-            <w:tcW w:w="4680" w:type="dxa"/>
-          </w:tcPr>
-          <w:p>
-            <w:pPr>
-              <w:spacing w:after="0"/>
-            </w:pPr>
-            <w:r>
-              <w:t xml:space="preserve">Quarterly business review that always proposes the next phase</w:t>
-            </w:r>
-          </w:p>
-        </w:tc>
-      </w:tr>
-      <w:tr>
-        <w:tc>
-          <w:tcPr>
-            <w:tcW w:w="4680" w:type="dxa"/>
-          </w:tcPr>
-          <w:p>
-            <w:pPr>
-              <w:spacing w:after="0"/>
-            </w:pPr>
-            <w:r>
-              <w:t xml:space="preserve">Switching cost (earned)</w:t>
-            </w:r>
-          </w:p>
-        </w:tc>
-        <w:tc>
-          <w:tcPr>
-            <w:tcW w:w="4680" w:type="dxa"/>
-          </w:tcPr>
-          <w:p>
-            <w:pPr>
-              <w:spacing w:after="0"/>
-            </w:pPr>
-            <w:r>
-              <w:t xml:space="preserve">Integrated data and systems make us part of their operating fabric</w:t>
-            </w:r>
-          </w:p>
-        </w:tc>
-      </w:tr>
-      <w:tr>
-        <w:tc>
-          <w:tcPr>
-            <w:tcW w:w="4680" w:type="dxa"/>
-          </w:tcPr>
-          <w:p>
-            <w:pPr>
-              <w:spacing w:after="0"/>
-            </w:pPr>
-            <w:r>
-              <w:t xml:space="preserve">Responsiveness</w:t>
-            </w:r>
-          </w:p>
-        </w:tc>
-        <w:tc>
-          <w:tcPr>
-            <w:tcW w:w="4680" w:type="dxa"/>
-          </w:tcPr>
-          <w:p>
-            <w:pPr>
-              <w:spacing w:after="0"/>
-            </w:pPr>
-            <w:r>
-              <w:t xml:space="preserve">SLAs, fast communication, no dropped balls</w:t>
-            </w:r>
-          </w:p>
-        </w:tc>
-      </w:tr>
-      <w:tr>
-        <w:tc>
-          <w:tcPr>
-            <w:tcW w:w="4680" w:type="dxa"/>
-          </w:tcPr>
-          <w:p>
-            <w:pPr>
-              <w:spacing w:after="0"/>
-            </w:pPr>
-            <w:r>
-              <w:t xml:space="preserve">Relationship depth</w:t>
-            </w:r>
-          </w:p>
-        </w:tc>
-        <w:tc>
-          <w:tcPr>
-            <w:tcW w:w="4680" w:type="dxa"/>
-          </w:tcPr>
-          <w:p>
-            <w:pPr>
-              <w:spacing w:after="0"/>
-            </w:pPr>
-            <w:r>
-              <w:t xml:space="preserve">Multiple stakeholders on both sides, not a single point of contact</w:t>
-            </w:r>
-          </w:p>
-        </w:tc>
-      </w:tr>
-    </w:tbl>
-    <w:p/>
-    <w:p>
-      <w:pPr>
-        <w:pStyle w:val="Heading2"/>
-      </w:pPr>
-      <w:r>
-        <w:t xml:space="preserve">The Quarterly Business Review (QBR) — the retention engine</w:t>
-      </w:r>
-    </w:p>
-    <w:p>
-      <w:r>
-        <w:t xml:space="preserve">Every retainer client gets a QBR structured as: Results (what we did and what it produced, KPI deltas versus targets), then Insights (what the data is telling us — the part they cannot get elsewhere), then Maturity check (re-score them on the lifecycle map), then Roadmap (the next one to two phases and the projects that unlock them), then Proposal (a concrete, costed next step). No QBR should end without a confirmed continuation and a proposed expansion.</w:t>
-      </w:r>
-    </w:p>
-    <w:p>
-      <w:pPr>
-        <w:pStyle w:val="Heading2"/>
-      </w:pPr>
-      <w:r>
-        <w:t xml:space="preserve">Churn early-warning system</w:t>
+        <w:t xml:space="preserve">The digital channel portfolio</w:t>
       </w:r>
     </w:p>
     <w:tbl>
@@ -8635,7 +7868,7 @@
               <w:rPr>
                 <w:b/>
               </w:rPr>
-              <w:t xml:space="preserve">Signal</w:t>
+              <w:t xml:space="preserve">Channel</w:t>
             </w:r>
           </w:p>
         </w:tc>
@@ -8652,7 +7885,7 @@
               <w:rPr>
                 <w:b/>
               </w:rPr>
-              <w:t xml:space="preserve">Risk</w:t>
+              <w:t xml:space="preserve">Primary job</w:t>
             </w:r>
           </w:p>
         </w:tc>
@@ -8669,253 +7902,417 @@
               <w:rPr>
                 <w:b/>
               </w:rPr>
-              <w:t xml:space="preserve">Play</w:t>
-            </w:r>
-          </w:p>
-        </w:tc>
-      </w:tr>
-      <w:tr>
-        <w:tc>
-          <w:tcPr>
-            <w:tcW w:w="3120" w:type="dxa"/>
-          </w:tcPr>
-          <w:p>
-            <w:pPr>
-              <w:spacing w:after="0"/>
-            </w:pPr>
-            <w:r>
-              <w:t xml:space="preserve">Falling engagement (slow replies, skipped QBRs)</w:t>
-            </w:r>
-          </w:p>
-        </w:tc>
-        <w:tc>
-          <w:tcPr>
-            <w:tcW w:w="3120" w:type="dxa"/>
-          </w:tcPr>
-          <w:p>
-            <w:pPr>
-              <w:spacing w:after="0"/>
-            </w:pPr>
-            <w:r>
-              <w:t xml:space="preserve">High</w:t>
-            </w:r>
-          </w:p>
-        </w:tc>
-        <w:tc>
-          <w:tcPr>
-            <w:tcW w:w="3120" w:type="dxa"/>
-          </w:tcPr>
-          <w:p>
-            <w:pPr>
-              <w:spacing w:after="0"/>
-            </w:pPr>
-            <w:r>
-              <w:t xml:space="preserve">Executive check-in, re-establish value</w:t>
-            </w:r>
-          </w:p>
-        </w:tc>
-      </w:tr>
-      <w:tr>
-        <w:tc>
-          <w:tcPr>
-            <w:tcW w:w="3120" w:type="dxa"/>
-          </w:tcPr>
-          <w:p>
-            <w:pPr>
-              <w:spacing w:after="0"/>
-            </w:pPr>
-            <w:r>
-              <w:t xml:space="preserve">Flat or negative KPIs</w:t>
-            </w:r>
-          </w:p>
-        </w:tc>
-        <w:tc>
-          <w:tcPr>
-            <w:tcW w:w="3120" w:type="dxa"/>
-          </w:tcPr>
-          <w:p>
-            <w:pPr>
-              <w:spacing w:after="0"/>
-            </w:pPr>
-            <w:r>
-              <w:t xml:space="preserve">High</w:t>
-            </w:r>
-          </w:p>
-        </w:tc>
-        <w:tc>
-          <w:tcPr>
-            <w:tcW w:w="3120" w:type="dxa"/>
-          </w:tcPr>
-          <w:p>
-            <w:pPr>
-              <w:spacing w:after="0"/>
-            </w:pPr>
-            <w:r>
-              <w:t xml:space="preserve">Diagnostic plus reset plan before they ask</w:t>
-            </w:r>
-          </w:p>
-        </w:tc>
-      </w:tr>
-      <w:tr>
-        <w:tc>
-          <w:tcPr>
-            <w:tcW w:w="3120" w:type="dxa"/>
-          </w:tcPr>
-          <w:p>
-            <w:pPr>
-              <w:spacing w:after="0"/>
-            </w:pPr>
-            <w:r>
-              <w:t xml:space="preserve">Single point of contact leaves</w:t>
-            </w:r>
-          </w:p>
-        </w:tc>
-        <w:tc>
-          <w:tcPr>
-            <w:tcW w:w="3120" w:type="dxa"/>
-          </w:tcPr>
-          <w:p>
-            <w:pPr>
-              <w:spacing w:after="0"/>
-            </w:pPr>
-            <w:r>
-              <w:t xml:space="preserve">High</w:t>
-            </w:r>
-          </w:p>
-        </w:tc>
-        <w:tc>
-          <w:tcPr>
-            <w:tcW w:w="3120" w:type="dxa"/>
-          </w:tcPr>
-          <w:p>
-            <w:pPr>
-              <w:spacing w:after="0"/>
-            </w:pPr>
-            <w:r>
-              <w:t xml:space="preserve">Multi-thread the relationship fast</w:t>
-            </w:r>
-          </w:p>
-        </w:tc>
-      </w:tr>
-      <w:tr>
-        <w:tc>
-          <w:tcPr>
-            <w:tcW w:w="3120" w:type="dxa"/>
-          </w:tcPr>
-          <w:p>
-            <w:pPr>
-              <w:spacing w:after="0"/>
-            </w:pPr>
-            <w:r>
-              <w:t xml:space="preserve">Scope shrinking</w:t>
-            </w:r>
-          </w:p>
-        </w:tc>
-        <w:tc>
-          <w:tcPr>
-            <w:tcW w:w="3120" w:type="dxa"/>
-          </w:tcPr>
-          <w:p>
-            <w:pPr>
-              <w:spacing w:after="0"/>
-            </w:pPr>
-            <w:r>
-              <w:t xml:space="preserve">Medium</w:t>
-            </w:r>
-          </w:p>
-        </w:tc>
-        <w:tc>
-          <w:tcPr>
-            <w:tcW w:w="3120" w:type="dxa"/>
-          </w:tcPr>
-          <w:p>
-            <w:pPr>
-              <w:spacing w:after="0"/>
-            </w:pPr>
-            <w:r>
-              <w:t xml:space="preserve">Re-discover needs; re-map maturity</w:t>
-            </w:r>
-          </w:p>
-        </w:tc>
-      </w:tr>
-      <w:tr>
-        <w:tc>
-          <w:tcPr>
-            <w:tcW w:w="3120" w:type="dxa"/>
-          </w:tcPr>
-          <w:p>
-            <w:pPr>
-              <w:spacing w:after="0"/>
-            </w:pPr>
-            <w:r>
-              <w:t xml:space="preserve">Price sensitivity / discount requests</w:t>
-            </w:r>
-          </w:p>
-        </w:tc>
-        <w:tc>
-          <w:tcPr>
-            <w:tcW w:w="3120" w:type="dxa"/>
-          </w:tcPr>
-          <w:p>
-            <w:pPr>
-              <w:spacing w:after="0"/>
-            </w:pPr>
-            <w:r>
-              <w:t xml:space="preserve">Medium</w:t>
-            </w:r>
-          </w:p>
-        </w:tc>
-        <w:tc>
-          <w:tcPr>
-            <w:tcW w:w="3120" w:type="dxa"/>
-          </w:tcPr>
-          <w:p>
-            <w:pPr>
-              <w:spacing w:after="0"/>
-            </w:pPr>
-            <w:r>
-              <w:t xml:space="preserve">Re-anchor on ROI and outcomes</w:t>
-            </w:r>
-          </w:p>
-        </w:tc>
-      </w:tr>
-      <w:tr>
-        <w:tc>
-          <w:tcPr>
-            <w:tcW w:w="3120" w:type="dxa"/>
-          </w:tcPr>
-          <w:p>
-            <w:pPr>
-              <w:spacing w:after="0"/>
-            </w:pPr>
-            <w:r>
-              <w:t xml:space="preserve">Going quiet near renewal</w:t>
-            </w:r>
-          </w:p>
-        </w:tc>
-        <w:tc>
-          <w:tcPr>
-            <w:tcW w:w="3120" w:type="dxa"/>
-          </w:tcPr>
-          <w:p>
-            <w:pPr>
-              <w:spacing w:after="0"/>
-            </w:pPr>
-            <w:r>
-              <w:t xml:space="preserve">High</w:t>
-            </w:r>
-          </w:p>
-        </w:tc>
-        <w:tc>
-          <w:tcPr>
-            <w:tcW w:w="3120" w:type="dxa"/>
-          </w:tcPr>
-          <w:p>
-            <w:pPr>
-              <w:spacing w:after="0"/>
-            </w:pPr>
-            <w:r>
-              <w:t xml:space="preserve">Proactive renewal conversation 60+ days out</w:t>
+              <w:t xml:space="preserve">Phase emphasis</w:t>
+            </w:r>
+          </w:p>
+        </w:tc>
+      </w:tr>
+      <w:tr>
+        <w:tc>
+          <w:tcPr>
+            <w:tcW w:w="3120" w:type="dxa"/>
+          </w:tcPr>
+          <w:p>
+            <w:pPr>
+              <w:spacing w:after="0"/>
+            </w:pPr>
+            <w:r>
+              <w:t xml:space="preserve">SEO &amp; content</w:t>
+            </w:r>
+          </w:p>
+        </w:tc>
+        <w:tc>
+          <w:tcPr>
+            <w:tcW w:w="3120" w:type="dxa"/>
+          </w:tcPr>
+          <w:p>
+            <w:pPr>
+              <w:spacing w:after="0"/>
+            </w:pPr>
+            <w:r>
+              <w:t xml:space="preserve">Capture existing demand, build authority</w:t>
+            </w:r>
+          </w:p>
+        </w:tc>
+        <w:tc>
+          <w:tcPr>
+            <w:tcW w:w="3120" w:type="dxa"/>
+          </w:tcPr>
+          <w:p>
+            <w:pPr>
+              <w:spacing w:after="0"/>
+            </w:pPr>
+            <w:r>
+              <w:t xml:space="preserve">3 to 7</w:t>
+            </w:r>
+          </w:p>
+        </w:tc>
+      </w:tr>
+      <w:tr>
+        <w:tc>
+          <w:tcPr>
+            <w:tcW w:w="3120" w:type="dxa"/>
+          </w:tcPr>
+          <w:p>
+            <w:pPr>
+              <w:spacing w:after="0"/>
+            </w:pPr>
+            <w:r>
+              <w:t xml:space="preserve">Paid search (PPC)</w:t>
+            </w:r>
+          </w:p>
+        </w:tc>
+        <w:tc>
+          <w:tcPr>
+            <w:tcW w:w="3120" w:type="dxa"/>
+          </w:tcPr>
+          <w:p>
+            <w:pPr>
+              <w:spacing w:after="0"/>
+            </w:pPr>
+            <w:r>
+              <w:t xml:space="preserve">Convert high-intent demand</w:t>
+            </w:r>
+          </w:p>
+        </w:tc>
+        <w:tc>
+          <w:tcPr>
+            <w:tcW w:w="3120" w:type="dxa"/>
+          </w:tcPr>
+          <w:p>
+            <w:pPr>
+              <w:spacing w:after="0"/>
+            </w:pPr>
+            <w:r>
+              <w:t xml:space="preserve">4 to 6</w:t>
+            </w:r>
+          </w:p>
+        </w:tc>
+      </w:tr>
+      <w:tr>
+        <w:tc>
+          <w:tcPr>
+            <w:tcW w:w="3120" w:type="dxa"/>
+          </w:tcPr>
+          <w:p>
+            <w:pPr>
+              <w:spacing w:after="0"/>
+            </w:pPr>
+            <w:r>
+              <w:t xml:space="preserve">Paid social</w:t>
+            </w:r>
+          </w:p>
+        </w:tc>
+        <w:tc>
+          <w:tcPr>
+            <w:tcW w:w="3120" w:type="dxa"/>
+          </w:tcPr>
+          <w:p>
+            <w:pPr>
+              <w:spacing w:after="0"/>
+            </w:pPr>
+            <w:r>
+              <w:t xml:space="preserve">Create demand, retarget</w:t>
+            </w:r>
+          </w:p>
+        </w:tc>
+        <w:tc>
+          <w:tcPr>
+            <w:tcW w:w="3120" w:type="dxa"/>
+          </w:tcPr>
+          <w:p>
+            <w:pPr>
+              <w:spacing w:after="0"/>
+            </w:pPr>
+            <w:r>
+              <w:t xml:space="preserve">4 to 6</w:t>
+            </w:r>
+          </w:p>
+        </w:tc>
+      </w:tr>
+      <w:tr>
+        <w:tc>
+          <w:tcPr>
+            <w:tcW w:w="3120" w:type="dxa"/>
+          </w:tcPr>
+          <w:p>
+            <w:pPr>
+              <w:spacing w:after="0"/>
+            </w:pPr>
+            <w:r>
+              <w:t xml:space="preserve">Video / YouTube</w:t>
+            </w:r>
+          </w:p>
+        </w:tc>
+        <w:tc>
+          <w:tcPr>
+            <w:tcW w:w="3120" w:type="dxa"/>
+          </w:tcPr>
+          <w:p>
+            <w:pPr>
+              <w:spacing w:after="0"/>
+            </w:pPr>
+            <w:r>
+              <w:t xml:space="preserve">Awareness, education, retargeting</w:t>
+            </w:r>
+          </w:p>
+        </w:tc>
+        <w:tc>
+          <w:tcPr>
+            <w:tcW w:w="3120" w:type="dxa"/>
+          </w:tcPr>
+          <w:p>
+            <w:pPr>
+              <w:spacing w:after="0"/>
+            </w:pPr>
+            <w:r>
+              <w:t xml:space="preserve">4 to 7</w:t>
+            </w:r>
+          </w:p>
+        </w:tc>
+      </w:tr>
+      <w:tr>
+        <w:tc>
+          <w:tcPr>
+            <w:tcW w:w="3120" w:type="dxa"/>
+          </w:tcPr>
+          <w:p>
+            <w:pPr>
+              <w:spacing w:after="0"/>
+            </w:pPr>
+            <w:r>
+              <w:t xml:space="preserve">Email / SMS / push</w:t>
+            </w:r>
+          </w:p>
+        </w:tc>
+        <w:tc>
+          <w:tcPr>
+            <w:tcW w:w="3120" w:type="dxa"/>
+          </w:tcPr>
+          <w:p>
+            <w:pPr>
+              <w:spacing w:after="0"/>
+            </w:pPr>
+            <w:r>
+              <w:t xml:space="preserve">Nurture, retain, reactivate</w:t>
+            </w:r>
+          </w:p>
+        </w:tc>
+        <w:tc>
+          <w:tcPr>
+            <w:tcW w:w="3120" w:type="dxa"/>
+          </w:tcPr>
+          <w:p>
+            <w:pPr>
+              <w:spacing w:after="0"/>
+            </w:pPr>
+            <w:r>
+              <w:t xml:space="preserve">4 to 7</w:t>
+            </w:r>
+          </w:p>
+        </w:tc>
+      </w:tr>
+      <w:tr>
+        <w:tc>
+          <w:tcPr>
+            <w:tcW w:w="3120" w:type="dxa"/>
+          </w:tcPr>
+          <w:p>
+            <w:pPr>
+              <w:spacing w:after="0"/>
+            </w:pPr>
+            <w:r>
+              <w:t xml:space="preserve">Organic social</w:t>
+            </w:r>
+          </w:p>
+        </w:tc>
+        <w:tc>
+          <w:tcPr>
+            <w:tcW w:w="3120" w:type="dxa"/>
+          </w:tcPr>
+          <w:p>
+            <w:pPr>
+              <w:spacing w:after="0"/>
+            </w:pPr>
+            <w:r>
+              <w:t xml:space="preserve">Brand, community, social proof</w:t>
+            </w:r>
+          </w:p>
+        </w:tc>
+        <w:tc>
+          <w:tcPr>
+            <w:tcW w:w="3120" w:type="dxa"/>
+          </w:tcPr>
+          <w:p>
+            <w:pPr>
+              <w:spacing w:after="0"/>
+            </w:pPr>
+            <w:r>
+              <w:t xml:space="preserve">2 to 7</w:t>
+            </w:r>
+          </w:p>
+        </w:tc>
+      </w:tr>
+      <w:tr>
+        <w:tc>
+          <w:tcPr>
+            <w:tcW w:w="3120" w:type="dxa"/>
+          </w:tcPr>
+          <w:p>
+            <w:pPr>
+              <w:spacing w:after="0"/>
+            </w:pPr>
+            <w:r>
+              <w:t xml:space="preserve">Digital PR &amp; influencer</w:t>
+            </w:r>
+          </w:p>
+        </w:tc>
+        <w:tc>
+          <w:tcPr>
+            <w:tcW w:w="3120" w:type="dxa"/>
+          </w:tcPr>
+          <w:p>
+            <w:pPr>
+              <w:spacing w:after="0"/>
+            </w:pPr>
+            <w:r>
+              <w:t xml:space="preserve">Credibility, reach, backlinks</w:t>
+            </w:r>
+          </w:p>
+        </w:tc>
+        <w:tc>
+          <w:tcPr>
+            <w:tcW w:w="3120" w:type="dxa"/>
+          </w:tcPr>
+          <w:p>
+            <w:pPr>
+              <w:spacing w:after="0"/>
+            </w:pPr>
+            <w:r>
+              <w:t xml:space="preserve">4, 6, 7</w:t>
+            </w:r>
+          </w:p>
+        </w:tc>
+      </w:tr>
+      <w:tr>
+        <w:tc>
+          <w:tcPr>
+            <w:tcW w:w="3120" w:type="dxa"/>
+          </w:tcPr>
+          <w:p>
+            <w:pPr>
+              <w:spacing w:after="0"/>
+            </w:pPr>
+            <w:r>
+              <w:t xml:space="preserve">Marketplaces &amp; affiliate</w:t>
+            </w:r>
+          </w:p>
+        </w:tc>
+        <w:tc>
+          <w:tcPr>
+            <w:tcW w:w="3120" w:type="dxa"/>
+          </w:tcPr>
+          <w:p>
+            <w:pPr>
+              <w:spacing w:after="0"/>
+            </w:pPr>
+            <w:r>
+              <w:t xml:space="preserve">Reach and distribution</w:t>
+            </w:r>
+          </w:p>
+        </w:tc>
+        <w:tc>
+          <w:tcPr>
+            <w:tcW w:w="3120" w:type="dxa"/>
+          </w:tcPr>
+          <w:p>
+            <w:pPr>
+              <w:spacing w:after="0"/>
+            </w:pPr>
+            <w:r>
+              <w:t xml:space="preserve">6</w:t>
+            </w:r>
+          </w:p>
+        </w:tc>
+      </w:tr>
+      <w:tr>
+        <w:tc>
+          <w:tcPr>
+            <w:tcW w:w="3120" w:type="dxa"/>
+          </w:tcPr>
+          <w:p>
+            <w:pPr>
+              <w:spacing w:after="0"/>
+            </w:pPr>
+            <w:r>
+              <w:t xml:space="preserve">Website / app / e-commerce</w:t>
+            </w:r>
+          </w:p>
+        </w:tc>
+        <w:tc>
+          <w:tcPr>
+            <w:tcW w:w="3120" w:type="dxa"/>
+          </w:tcPr>
+          <w:p>
+            <w:pPr>
+              <w:spacing w:after="0"/>
+            </w:pPr>
+            <w:r>
+              <w:t xml:space="preserve">Convert and transact</w:t>
+            </w:r>
+          </w:p>
+        </w:tc>
+        <w:tc>
+          <w:tcPr>
+            <w:tcW w:w="3120" w:type="dxa"/>
+          </w:tcPr>
+          <w:p>
+            <w:pPr>
+              <w:spacing w:after="0"/>
+            </w:pPr>
+            <w:r>
+              <w:t xml:space="preserve">3 to 7</w:t>
+            </w:r>
+          </w:p>
+        </w:tc>
+      </w:tr>
+      <w:tr>
+        <w:tc>
+          <w:tcPr>
+            <w:tcW w:w="3120" w:type="dxa"/>
+          </w:tcPr>
+          <w:p>
+            <w:pPr>
+              <w:spacing w:after="0"/>
+            </w:pPr>
+            <w:r>
+              <w:t xml:space="preserve">Online community</w:t>
+            </w:r>
+          </w:p>
+        </w:tc>
+        <w:tc>
+          <w:tcPr>
+            <w:tcW w:w="3120" w:type="dxa"/>
+          </w:tcPr>
+          <w:p>
+            <w:pPr>
+              <w:spacing w:after="0"/>
+            </w:pPr>
+            <w:r>
+              <w:t xml:space="preserve">Retention, advocacy, insight</w:t>
+            </w:r>
+          </w:p>
+        </w:tc>
+        <w:tc>
+          <w:tcPr>
+            <w:tcW w:w="3120" w:type="dxa"/>
+          </w:tcPr>
+          <w:p>
+            <w:pPr>
+              <w:spacing w:after="0"/>
+            </w:pPr>
+            <w:r>
+              <w:t xml:space="preserve">5 to 7</w:t>
             </w:r>
           </w:p>
         </w:tc>
@@ -8927,12 +8324,12 @@
         <w:pStyle w:val="Heading2"/>
       </w:pPr>
       <w:r>
-        <w:t xml:space="preserve">Helping clients retain their customers (the Phase 5 service)</w:t>
-      </w:r>
-    </w:p>
-    <w:p>
-      <w:r>
-        <w:t xml:space="preserve">This is what we sell, and it mirrors our own model. The customer value retention loop runs: Acquire, then Onboard (first value fast), then Engage (lifecycle comms), then Reward (loyalty), then Advocate (referrals/reviews), and back to Acquire — with a Recover (win-back) path whenever engagement signals risk.</w:t>
+        <w:t xml:space="preserve">The connection mechanisms</w:t>
+      </w:r>
+    </w:p>
+    <w:p>
+      <w:r>
+        <w:t xml:space="preserve">A "360° digital" promise is only real if the channels are technically wired together. These mechanisms keep the funnel unbroken and attributable. Rule: no channel goes live without tracking and CRM wiring in place.</w:t>
       </w:r>
     </w:p>
     <w:tbl>
@@ -8968,7 +8365,7 @@
               <w:rPr>
                 <w:b/>
               </w:rPr>
-              <w:t xml:space="preserve">Lever</w:t>
+              <w:t xml:space="preserve">Mechanism</w:t>
             </w:r>
           </w:p>
         </w:tc>
@@ -8985,7 +8382,7 @@
               <w:rPr>
                 <w:b/>
               </w:rPr>
-              <w:t xml:space="preserve">Tools / tactics</w:t>
+              <w:t xml:space="preserve">Connects</w:t>
             </w:r>
           </w:p>
         </w:tc>
@@ -9002,294 +8399,294 @@
               <w:rPr>
                 <w:b/>
               </w:rPr>
-              <w:t xml:space="preserve">Service line</w:t>
-            </w:r>
-          </w:p>
-        </w:tc>
-      </w:tr>
-      <w:tr>
-        <w:tc>
-          <w:tcPr>
-            <w:tcW w:w="3120" w:type="dxa"/>
-          </w:tcPr>
-          <w:p>
-            <w:pPr>
-              <w:spacing w:after="0"/>
-            </w:pPr>
-            <w:r>
-              <w:t xml:space="preserve">Onboarding</w:t>
-            </w:r>
-          </w:p>
-        </w:tc>
-        <w:tc>
-          <w:tcPr>
-            <w:tcW w:w="3120" w:type="dxa"/>
-          </w:tcPr>
-          <w:p>
-            <w:pPr>
-              <w:spacing w:after="0"/>
-            </w:pPr>
-            <w:r>
-              <w:t xml:space="preserve">Welcome flows, setup help, first-value milestones</w:t>
-            </w:r>
-          </w:p>
-        </w:tc>
-        <w:tc>
-          <w:tcPr>
-            <w:tcW w:w="3120" w:type="dxa"/>
-          </w:tcPr>
-          <w:p>
-            <w:pPr>
-              <w:spacing w:after="0"/>
-            </w:pPr>
-            <w:r>
-              <w:t xml:space="preserve">CX + Automation</w:t>
-            </w:r>
-          </w:p>
-        </w:tc>
-      </w:tr>
-      <w:tr>
-        <w:tc>
-          <w:tcPr>
-            <w:tcW w:w="3120" w:type="dxa"/>
-          </w:tcPr>
-          <w:p>
-            <w:pPr>
-              <w:spacing w:after="0"/>
-            </w:pPr>
-            <w:r>
-              <w:t xml:space="preserve">Lifecycle marketing</w:t>
-            </w:r>
-          </w:p>
-        </w:tc>
-        <w:tc>
-          <w:tcPr>
-            <w:tcW w:w="3120" w:type="dxa"/>
-          </w:tcPr>
-          <w:p>
-            <w:pPr>
-              <w:spacing w:after="0"/>
-            </w:pPr>
-            <w:r>
-              <w:t xml:space="preserve">Segmented email/SMS, triggered campaigns</w:t>
-            </w:r>
-          </w:p>
-        </w:tc>
-        <w:tc>
-          <w:tcPr>
-            <w:tcW w:w="3120" w:type="dxa"/>
-          </w:tcPr>
-          <w:p>
-            <w:pPr>
-              <w:spacing w:after="0"/>
-            </w:pPr>
-            <w:r>
-              <w:t xml:space="preserve">Marketing + Automation</w:t>
-            </w:r>
-          </w:p>
-        </w:tc>
-      </w:tr>
-      <w:tr>
-        <w:tc>
-          <w:tcPr>
-            <w:tcW w:w="3120" w:type="dxa"/>
-          </w:tcPr>
-          <w:p>
-            <w:pPr>
-              <w:spacing w:after="0"/>
-            </w:pPr>
-            <w:r>
-              <w:t xml:space="preserve">Loyalty &amp; rewards</w:t>
-            </w:r>
-          </w:p>
-        </w:tc>
-        <w:tc>
-          <w:tcPr>
-            <w:tcW w:w="3120" w:type="dxa"/>
-          </w:tcPr>
-          <w:p>
-            <w:pPr>
-              <w:spacing w:after="0"/>
-            </w:pPr>
-            <w:r>
-              <w:t xml:space="preserve">Points, tiers, referrals, VIP perks</w:t>
-            </w:r>
-          </w:p>
-        </w:tc>
-        <w:tc>
-          <w:tcPr>
-            <w:tcW w:w="3120" w:type="dxa"/>
-          </w:tcPr>
-          <w:p>
-            <w:pPr>
-              <w:spacing w:after="0"/>
-            </w:pPr>
-            <w:r>
-              <w:t xml:space="preserve">CX + Marketing</w:t>
-            </w:r>
-          </w:p>
-        </w:tc>
-      </w:tr>
-      <w:tr>
-        <w:tc>
-          <w:tcPr>
-            <w:tcW w:w="3120" w:type="dxa"/>
-          </w:tcPr>
-          <w:p>
-            <w:pPr>
-              <w:spacing w:after="0"/>
-            </w:pPr>
-            <w:r>
-              <w:t xml:space="preserve">Support excellence</w:t>
-            </w:r>
-          </w:p>
-        </w:tc>
-        <w:tc>
-          <w:tcPr>
-            <w:tcW w:w="3120" w:type="dxa"/>
-          </w:tcPr>
-          <w:p>
-            <w:pPr>
-              <w:spacing w:after="0"/>
-            </w:pPr>
-            <w:r>
-              <w:t xml:space="preserve">Helpdesk, chatbot, SLAs, omnichannel</w:t>
-            </w:r>
-          </w:p>
-        </w:tc>
-        <w:tc>
-          <w:tcPr>
-            <w:tcW w:w="3120" w:type="dxa"/>
-          </w:tcPr>
-          <w:p>
-            <w:pPr>
-              <w:spacing w:after="0"/>
-            </w:pPr>
-            <w:r>
-              <w:t xml:space="preserve">CX + Tech</w:t>
-            </w:r>
-          </w:p>
-        </w:tc>
-      </w:tr>
-      <w:tr>
-        <w:tc>
-          <w:tcPr>
-            <w:tcW w:w="3120" w:type="dxa"/>
-          </w:tcPr>
-          <w:p>
-            <w:pPr>
-              <w:spacing w:after="0"/>
-            </w:pPr>
-            <w:r>
-              <w:t xml:space="preserve">Reputation</w:t>
-            </w:r>
-          </w:p>
-        </w:tc>
-        <w:tc>
-          <w:tcPr>
-            <w:tcW w:w="3120" w:type="dxa"/>
-          </w:tcPr>
-          <w:p>
-            <w:pPr>
-              <w:spacing w:after="0"/>
-            </w:pPr>
-            <w:r>
-              <w:t xml:space="preserve">Review generation and management</w:t>
-            </w:r>
-          </w:p>
-        </w:tc>
-        <w:tc>
-          <w:tcPr>
-            <w:tcW w:w="3120" w:type="dxa"/>
-          </w:tcPr>
-          <w:p>
-            <w:pPr>
-              <w:spacing w:after="0"/>
-            </w:pPr>
-            <w:r>
-              <w:t xml:space="preserve">Branding + Marketing</w:t>
-            </w:r>
-          </w:p>
-        </w:tc>
-      </w:tr>
-      <w:tr>
-        <w:tc>
-          <w:tcPr>
-            <w:tcW w:w="3120" w:type="dxa"/>
-          </w:tcPr>
-          <w:p>
-            <w:pPr>
-              <w:spacing w:after="0"/>
-            </w:pPr>
-            <w:r>
-              <w:t xml:space="preserve">Win-back</w:t>
-            </w:r>
-          </w:p>
-        </w:tc>
-        <w:tc>
-          <w:tcPr>
-            <w:tcW w:w="3120" w:type="dxa"/>
-          </w:tcPr>
-          <w:p>
-            <w:pPr>
-              <w:spacing w:after="0"/>
-            </w:pPr>
-            <w:r>
-              <w:t xml:space="preserve">Churn prediction plus reactivation offers</w:t>
-            </w:r>
-          </w:p>
-        </w:tc>
-        <w:tc>
-          <w:tcPr>
-            <w:tcW w:w="3120" w:type="dxa"/>
-          </w:tcPr>
-          <w:p>
-            <w:pPr>
-              <w:spacing w:after="0"/>
-            </w:pPr>
-            <w:r>
-              <w:t xml:space="preserve">Data + Marketing</w:t>
-            </w:r>
-          </w:p>
-        </w:tc>
-      </w:tr>
-      <w:tr>
-        <w:tc>
-          <w:tcPr>
-            <w:tcW w:w="3120" w:type="dxa"/>
-          </w:tcPr>
-          <w:p>
-            <w:pPr>
-              <w:spacing w:after="0"/>
-            </w:pPr>
-            <w:r>
-              <w:t xml:space="preserve">Community</w:t>
-            </w:r>
-          </w:p>
-        </w:tc>
-        <w:tc>
-          <w:tcPr>
-            <w:tcW w:w="3120" w:type="dxa"/>
-          </w:tcPr>
-          <w:p>
-            <w:pPr>
-              <w:spacing w:after="0"/>
-            </w:pPr>
-            <w:r>
-              <w:t xml:space="preserve">Events, groups, content, advocacy</w:t>
-            </w:r>
-          </w:p>
-        </w:tc>
-        <w:tc>
-          <w:tcPr>
-            <w:tcW w:w="3120" w:type="dxa"/>
-          </w:tcPr>
-          <w:p>
-            <w:pPr>
-              <w:spacing w:after="0"/>
-            </w:pPr>
-            <w:r>
-              <w:t xml:space="preserve">Branding + Marketing</w:t>
+              <w:t xml:space="preserve">What it enables</w:t>
+            </w:r>
+          </w:p>
+        </w:tc>
+      </w:tr>
+      <w:tr>
+        <w:tc>
+          <w:tcPr>
+            <w:tcW w:w="3120" w:type="dxa"/>
+          </w:tcPr>
+          <w:p>
+            <w:pPr>
+              <w:spacing w:after="0"/>
+            </w:pPr>
+            <w:r>
+              <w:t xml:space="preserve">UTM tagging (consistent taxonomy)</w:t>
+            </w:r>
+          </w:p>
+        </w:tc>
+        <w:tc>
+          <w:tcPr>
+            <w:tcW w:w="3120" w:type="dxa"/>
+          </w:tcPr>
+          <w:p>
+            <w:pPr>
+              <w:spacing w:after="0"/>
+            </w:pPr>
+            <w:r>
+              <w:t xml:space="preserve">Every campaign to analytics</w:t>
+            </w:r>
+          </w:p>
+        </w:tc>
+        <w:tc>
+          <w:tcPr>
+            <w:tcW w:w="3120" w:type="dxa"/>
+          </w:tcPr>
+          <w:p>
+            <w:pPr>
+              <w:spacing w:after="0"/>
+            </w:pPr>
+            <w:r>
+              <w:t xml:space="preserve">Clean source/medium attribution</w:t>
+            </w:r>
+          </w:p>
+        </w:tc>
+      </w:tr>
+      <w:tr>
+        <w:tc>
+          <w:tcPr>
+            <w:tcW w:w="3120" w:type="dxa"/>
+          </w:tcPr>
+          <w:p>
+            <w:pPr>
+              <w:spacing w:after="0"/>
+            </w:pPr>
+            <w:r>
+              <w:t xml:space="preserve">Pixels &amp; server-side tracking</w:t>
+            </w:r>
+          </w:p>
+        </w:tc>
+        <w:tc>
+          <w:tcPr>
+            <w:tcW w:w="3120" w:type="dxa"/>
+          </w:tcPr>
+          <w:p>
+            <w:pPr>
+              <w:spacing w:after="0"/>
+            </w:pPr>
+            <w:r>
+              <w:t xml:space="preserve">Ads and site events</w:t>
+            </w:r>
+          </w:p>
+        </w:tc>
+        <w:tc>
+          <w:tcPr>
+            <w:tcW w:w="3120" w:type="dxa"/>
+          </w:tcPr>
+          <w:p>
+            <w:pPr>
+              <w:spacing w:after="0"/>
+            </w:pPr>
+            <w:r>
+              <w:t xml:space="preserve">Accurate conversion data, better optimization</w:t>
+            </w:r>
+          </w:p>
+        </w:tc>
+      </w:tr>
+      <w:tr>
+        <w:tc>
+          <w:tcPr>
+            <w:tcW w:w="3120" w:type="dxa"/>
+          </w:tcPr>
+          <w:p>
+            <w:pPr>
+              <w:spacing w:after="0"/>
+            </w:pPr>
+            <w:r>
+              <w:t xml:space="preserve">CRM / customer ID stitching</w:t>
+            </w:r>
+          </w:p>
+        </w:tc>
+        <w:tc>
+          <w:tcPr>
+            <w:tcW w:w="3120" w:type="dxa"/>
+          </w:tcPr>
+          <w:p>
+            <w:pPr>
+              <w:spacing w:after="0"/>
+            </w:pPr>
+            <w:r>
+              <w:t xml:space="preserve">Anonymous to known user</w:t>
+            </w:r>
+          </w:p>
+        </w:tc>
+        <w:tc>
+          <w:tcPr>
+            <w:tcW w:w="3120" w:type="dxa"/>
+          </w:tcPr>
+          <w:p>
+            <w:pPr>
+              <w:spacing w:after="0"/>
+            </w:pPr>
+            <w:r>
+              <w:t xml:space="preserve">One profile across sessions and channels</w:t>
+            </w:r>
+          </w:p>
+        </w:tc>
+      </w:tr>
+      <w:tr>
+        <w:tc>
+          <w:tcPr>
+            <w:tcW w:w="3120" w:type="dxa"/>
+          </w:tcPr>
+          <w:p>
+            <w:pPr>
+              <w:spacing w:after="0"/>
+            </w:pPr>
+            <w:r>
+              <w:t xml:space="preserve">Shared audiences</w:t>
+            </w:r>
+          </w:p>
+        </w:tc>
+        <w:tc>
+          <w:tcPr>
+            <w:tcW w:w="3120" w:type="dxa"/>
+          </w:tcPr>
+          <w:p>
+            <w:pPr>
+              <w:spacing w:after="0"/>
+            </w:pPr>
+            <w:r>
+              <w:t xml:space="preserve">CRM and ad platforms</w:t>
+            </w:r>
+          </w:p>
+        </w:tc>
+        <w:tc>
+          <w:tcPr>
+            <w:tcW w:w="3120" w:type="dxa"/>
+          </w:tcPr>
+          <w:p>
+            <w:pPr>
+              <w:spacing w:after="0"/>
+            </w:pPr>
+            <w:r>
+              <w:t xml:space="preserve">Retargeting, lookalikes, suppression lists</w:t>
+            </w:r>
+          </w:p>
+        </w:tc>
+      </w:tr>
+      <w:tr>
+        <w:tc>
+          <w:tcPr>
+            <w:tcW w:w="3120" w:type="dxa"/>
+          </w:tcPr>
+          <w:p>
+            <w:pPr>
+              <w:spacing w:after="0"/>
+            </w:pPr>
+            <w:r>
+              <w:t xml:space="preserve">Consent &amp; first-party data layer</w:t>
+            </w:r>
+          </w:p>
+        </w:tc>
+        <w:tc>
+          <w:tcPr>
+            <w:tcW w:w="3120" w:type="dxa"/>
+          </w:tcPr>
+          <w:p>
+            <w:pPr>
+              <w:spacing w:after="0"/>
+            </w:pPr>
+            <w:r>
+              <w:t xml:space="preserve">Site and all tools</w:t>
+            </w:r>
+          </w:p>
+        </w:tc>
+        <w:tc>
+          <w:tcPr>
+            <w:tcW w:w="3120" w:type="dxa"/>
+          </w:tcPr>
+          <w:p>
+            <w:pPr>
+              <w:spacing w:after="0"/>
+            </w:pPr>
+            <w:r>
+              <w:t xml:space="preserve">Privacy-safe, durable measurement</w:t>
+            </w:r>
+          </w:p>
+        </w:tc>
+      </w:tr>
+      <w:tr>
+        <w:tc>
+          <w:tcPr>
+            <w:tcW w:w="3120" w:type="dxa"/>
+          </w:tcPr>
+          <w:p>
+            <w:pPr>
+              <w:spacing w:after="0"/>
+            </w:pPr>
+            <w:r>
+              <w:t xml:space="preserve">Lead routing</w:t>
+            </w:r>
+          </w:p>
+        </w:tc>
+        <w:tc>
+          <w:tcPr>
+            <w:tcW w:w="3120" w:type="dxa"/>
+          </w:tcPr>
+          <w:p>
+            <w:pPr>
+              <w:spacing w:after="0"/>
+            </w:pPr>
+            <w:r>
+              <w:t xml:space="preserve">Forms/ads to CRM to sales</w:t>
+            </w:r>
+          </w:p>
+        </w:tc>
+        <w:tc>
+          <w:tcPr>
+            <w:tcW w:w="3120" w:type="dxa"/>
+          </w:tcPr>
+          <w:p>
+            <w:pPr>
+              <w:spacing w:after="0"/>
+            </w:pPr>
+            <w:r>
+              <w:t xml:space="preserve">No lead lost; full context for follow-up</w:t>
+            </w:r>
+          </w:p>
+        </w:tc>
+      </w:tr>
+      <w:tr>
+        <w:tc>
+          <w:tcPr>
+            <w:tcW w:w="3120" w:type="dxa"/>
+          </w:tcPr>
+          <w:p>
+            <w:pPr>
+              <w:spacing w:after="0"/>
+            </w:pPr>
+            <w:r>
+              <w:t xml:space="preserve">Marketing automation</w:t>
+            </w:r>
+          </w:p>
+        </w:tc>
+        <w:tc>
+          <w:tcPr>
+            <w:tcW w:w="3120" w:type="dxa"/>
+          </w:tcPr>
+          <w:p>
+            <w:pPr>
+              <w:spacing w:after="0"/>
+            </w:pPr>
+            <w:r>
+              <w:t xml:space="preserve">CRM and email/SMS</w:t>
+            </w:r>
+          </w:p>
+        </w:tc>
+        <w:tc>
+          <w:tcPr>
+            <w:tcW w:w="3120" w:type="dxa"/>
+          </w:tcPr>
+          <w:p>
+            <w:pPr>
+              <w:spacing w:after="0"/>
+            </w:pPr>
+            <w:r>
+              <w:t xml:space="preserve">Triggered lifecycle journeys at scale</w:t>
             </w:r>
           </w:p>
         </w:tc>
@@ -9297,8 +8694,16 @@
     </w:tbl>
     <w:p/>
     <w:p>
-      <w:r>
-        <w:t xml:space="preserve">The mirror principle: we sell retention because we practice retention. The same loop — deliver value, prove it, deepen the relationship, expand — runs at both levels. Retention is both our service and our business model.</w:t>
+      <w:pPr>
+        <w:pStyle w:val="Heading2"/>
+      </w:pPr>
+      <w:r>
+        <w:t xml:space="preserve">Budget allocation logic</w:t>
+      </w:r>
+    </w:p>
+    <w:p>
+      <w:r>
+        <w:t xml:space="preserve">Allocate by job-to-be-done and measured contribution, not by the channel each specialist likes to defend: start with an awareness/conversion/retention split appropriate to the phase (early phases lean awareness; later phases lean conversion and retention); measure every channel's contribution to the unified funnel (including assisted conversions, not just last-click); reallocate monthly toward the channels with the best marginal return; and protect a fixed percent for top-of-funnel/brand so the funnel keeps filling. The 360° digital advantage is that because we run every channel and measure them in one model, we can move budget to whatever works.</w:t>
       </w:r>
     </w:p>
     <w:p>
@@ -9306,12 +8711,12 @@
         <w:pStyle w:val="Heading1"/>
       </w:pPr>
       <w:r>
-        <w:t xml:space="preserve">Part 8 — Internal Team Structure by Phase</w:t>
-      </w:r>
-    </w:p>
-    <w:p>
-      <w:r>
-        <w:t xml:space="preserve">A 360° firm needs an org design that delivers a single relationship to the client while keeping deep specialist capability inside. The answer is a pod plus practice matrix: client-facing pods own the relationship; specialist practices own the craft.</w:t>
+        <w:t xml:space="preserve">Part 7 — Client Retention Model</w:t>
+      </w:r>
+    </w:p>
+    <w:p>
+      <w:r>
+        <w:t xml:space="preserve">Retention is the whole point. A 360° firm's enterprise value lives in recurring revenue and multi-year relationships. This model covers both retaining our clients and helping clients retain their customers. Both run on the same logic: deliver value, prove it, deepen the relationship, repeat.</w:t>
       </w:r>
     </w:p>
     <w:p>
@@ -9319,48 +8724,12 @@
         <w:pStyle w:val="Heading2"/>
       </w:pPr>
       <w:r>
-        <w:t xml:space="preserve">The operating model: pods x practices</w:t>
-      </w:r>
-    </w:p>
-    <w:p>
-      <w:pPr>
-        <w:numPr>
-          <w:ilvl w:val="0"/>
-          <w:numId w:val="1"/>
-        </w:numPr>
-        <w:spacing w:after="60"/>
-      </w:pPr>
-      <w:r>
-        <w:t xml:space="preserve">Pods are cross-functional, client-facing teams led by a Growth Partner Lead. They own the client roadmap, retention, and results across all phases.</w:t>
-      </w:r>
-    </w:p>
-    <w:p>
-      <w:pPr>
-        <w:numPr>
-          <w:ilvl w:val="0"/>
-          <w:numId w:val="1"/>
-        </w:numPr>
-        <w:spacing w:after="60"/>
-      </w:pPr>
-      <w:r>
-        <w:t xml:space="preserve">Practices are the centers of excellence (Strategy; Brand &amp; Creative; Web &amp; Tech; Marketing; Sales/CRM; CX &amp; Ops; Data &amp; AI; Finance &amp; Legal). Specialists live in a practice for craft, standards, and career growth, and are deployed into pods.</w:t>
-      </w:r>
-    </w:p>
-    <w:p>
-      <w:pPr>
-        <w:numPr>
-          <w:ilvl w:val="0"/>
-          <w:numId w:val="1"/>
-        </w:numPr>
-        <w:spacing w:after="60"/>
-      </w:pPr>
-      <w:r>
-        <w:t xml:space="preserve">Shared services (RevOps/PMO, Talent/L&amp;D, Finance/Admin) keep the firm running.</w:t>
-      </w:r>
-    </w:p>
-    <w:p>
-      <w:r>
-        <w:t xml:space="preserve">This is how firms stay integrated and deep: the client feels one team (the pod), while quality is guaranteed by the practices behind it.</w:t>
+        <w:t xml:space="preserve">Retaining our clients — the retention ladder</w:t>
+      </w:r>
+    </w:p>
+    <w:p>
+      <w:r>
+        <w:t xml:space="preserve">The ladder climbs: Project buyer (one service), then Repeat buyer (more projects), then Retainer client (recurring), then Multi-service partner (several lines), then Growth partner (strategic, multi-year), then Advocate (referrals plus case study). Each rung increases retention, margin, and lifetime value. The account team's job is to move every client up the ladder.</w:t>
       </w:r>
     </w:p>
     <w:p>
@@ -9368,7 +8737,252 @@
         <w:pStyle w:val="Heading2"/>
       </w:pPr>
       <w:r>
-        <w:t xml:space="preserve">Core roles</w:t>
+        <w:t xml:space="preserve">What drives agency retention</w:t>
+      </w:r>
+    </w:p>
+    <w:tbl>
+      <w:tblPr>
+        <w:tblW w:w="9360" w:type="dxa"/>
+        <w:tblLayout w:type="fixed"/>
+        <w:tblBorders>
+          <w:top w:val="single" w:sz="4" w:space="0" w:color="BFBFBF"/>
+          <w:left w:val="single" w:sz="4" w:space="0" w:color="BFBFBF"/>
+          <w:bottom w:val="single" w:sz="4" w:space="0" w:color="BFBFBF"/>
+          <w:right w:val="single" w:sz="4" w:space="0" w:color="BFBFBF"/>
+          <w:insideH w:val="single" w:sz="4" w:space="0" w:color="BFBFBF"/>
+          <w:insideV w:val="single" w:sz="4" w:space="0" w:color="BFBFBF"/>
+        </w:tblBorders>
+        <w:tblLook w:val="04A0" w:firstRow="1" w:lastRow="0" w:firstColumn="0" w:lastColumn="0" w:noHBand="0" w:noVBand="1"/>
+      </w:tblPr>
+      <w:tblGrid>
+        <w:gridCol w:w="4680"/>
+        <w:gridCol w:w="4680"/>
+      </w:tblGrid>
+      <w:tr>
+        <w:tc>
+          <w:tcPr>
+            <w:tcW w:w="4680" w:type="dxa"/>
+            <w:shd w:val="clear" w:color="auto" w:fill="D9E2F3"/>
+          </w:tcPr>
+          <w:p>
+            <w:pPr>
+              <w:spacing w:after="0"/>
+            </w:pPr>
+            <w:r>
+              <w:rPr>
+                <w:b/>
+              </w:rPr>
+              <w:t xml:space="preserve">Driver</w:t>
+            </w:r>
+          </w:p>
+        </w:tc>
+        <w:tc>
+          <w:tcPr>
+            <w:tcW w:w="4680" w:type="dxa"/>
+            <w:shd w:val="clear" w:color="auto" w:fill="D9E2F3"/>
+          </w:tcPr>
+          <w:p>
+            <w:pPr>
+              <w:spacing w:after="0"/>
+            </w:pPr>
+            <w:r>
+              <w:rPr>
+                <w:b/>
+              </w:rPr>
+              <w:t xml:space="preserve">How we operationalize it</w:t>
+            </w:r>
+          </w:p>
+        </w:tc>
+      </w:tr>
+      <w:tr>
+        <w:tc>
+          <w:tcPr>
+            <w:tcW w:w="4680" w:type="dxa"/>
+          </w:tcPr>
+          <w:p>
+            <w:pPr>
+              <w:spacing w:after="0"/>
+            </w:pPr>
+            <w:r>
+              <w:t xml:space="preserve">Proven ROI</w:t>
+            </w:r>
+          </w:p>
+        </w:tc>
+        <w:tc>
+          <w:tcPr>
+            <w:tcW w:w="4680" w:type="dxa"/>
+          </w:tcPr>
+          <w:p>
+            <w:pPr>
+              <w:spacing w:after="0"/>
+            </w:pPr>
+            <w:r>
+              <w:t xml:space="preserve">One shared dashboard that ties our work to the client's revenue</w:t>
+            </w:r>
+          </w:p>
+        </w:tc>
+      </w:tr>
+      <w:tr>
+        <w:tc>
+          <w:tcPr>
+            <w:tcW w:w="4680" w:type="dxa"/>
+          </w:tcPr>
+          <w:p>
+            <w:pPr>
+              <w:spacing w:after="0"/>
+            </w:pPr>
+            <w:r>
+              <w:t xml:space="preserve">Single relationship</w:t>
+            </w:r>
+          </w:p>
+        </w:tc>
+        <w:tc>
+          <w:tcPr>
+            <w:tcW w:w="4680" w:type="dxa"/>
+          </w:tcPr>
+          <w:p>
+            <w:pPr>
+              <w:spacing w:after="0"/>
+            </w:pPr>
+            <w:r>
+              <w:t xml:space="preserve">One account/growth-partner lead across all services</w:t>
+            </w:r>
+          </w:p>
+        </w:tc>
+      </w:tr>
+      <w:tr>
+        <w:tc>
+          <w:tcPr>
+            <w:tcW w:w="4680" w:type="dxa"/>
+          </w:tcPr>
+          <w:p>
+            <w:pPr>
+              <w:spacing w:after="0"/>
+            </w:pPr>
+            <w:r>
+              <w:t xml:space="preserve">Proactive roadmap</w:t>
+            </w:r>
+          </w:p>
+        </w:tc>
+        <w:tc>
+          <w:tcPr>
+            <w:tcW w:w="4680" w:type="dxa"/>
+          </w:tcPr>
+          <w:p>
+            <w:pPr>
+              <w:spacing w:after="0"/>
+            </w:pPr>
+            <w:r>
+              <w:t xml:space="preserve">Quarterly business review that always proposes the next phase</w:t>
+            </w:r>
+          </w:p>
+        </w:tc>
+      </w:tr>
+      <w:tr>
+        <w:tc>
+          <w:tcPr>
+            <w:tcW w:w="4680" w:type="dxa"/>
+          </w:tcPr>
+          <w:p>
+            <w:pPr>
+              <w:spacing w:after="0"/>
+            </w:pPr>
+            <w:r>
+              <w:t xml:space="preserve">Switching cost (earned)</w:t>
+            </w:r>
+          </w:p>
+        </w:tc>
+        <w:tc>
+          <w:tcPr>
+            <w:tcW w:w="4680" w:type="dxa"/>
+          </w:tcPr>
+          <w:p>
+            <w:pPr>
+              <w:spacing w:after="0"/>
+            </w:pPr>
+            <w:r>
+              <w:t xml:space="preserve">Integrated data and systems make us part of their operating fabric</w:t>
+            </w:r>
+          </w:p>
+        </w:tc>
+      </w:tr>
+      <w:tr>
+        <w:tc>
+          <w:tcPr>
+            <w:tcW w:w="4680" w:type="dxa"/>
+          </w:tcPr>
+          <w:p>
+            <w:pPr>
+              <w:spacing w:after="0"/>
+            </w:pPr>
+            <w:r>
+              <w:t xml:space="preserve">Responsiveness</w:t>
+            </w:r>
+          </w:p>
+        </w:tc>
+        <w:tc>
+          <w:tcPr>
+            <w:tcW w:w="4680" w:type="dxa"/>
+          </w:tcPr>
+          <w:p>
+            <w:pPr>
+              <w:spacing w:after="0"/>
+            </w:pPr>
+            <w:r>
+              <w:t xml:space="preserve">SLAs, fast communication, no dropped balls</w:t>
+            </w:r>
+          </w:p>
+        </w:tc>
+      </w:tr>
+      <w:tr>
+        <w:tc>
+          <w:tcPr>
+            <w:tcW w:w="4680" w:type="dxa"/>
+          </w:tcPr>
+          <w:p>
+            <w:pPr>
+              <w:spacing w:after="0"/>
+            </w:pPr>
+            <w:r>
+              <w:t xml:space="preserve">Relationship depth</w:t>
+            </w:r>
+          </w:p>
+        </w:tc>
+        <w:tc>
+          <w:tcPr>
+            <w:tcW w:w="4680" w:type="dxa"/>
+          </w:tcPr>
+          <w:p>
+            <w:pPr>
+              <w:spacing w:after="0"/>
+            </w:pPr>
+            <w:r>
+              <w:t xml:space="preserve">Multiple stakeholders on both sides, not a single point of contact</w:t>
+            </w:r>
+          </w:p>
+        </w:tc>
+      </w:tr>
+    </w:tbl>
+    <w:p/>
+    <w:p>
+      <w:pPr>
+        <w:pStyle w:val="Heading2"/>
+      </w:pPr>
+      <w:r>
+        <w:t xml:space="preserve">The Quarterly Business Review (QBR) — the retention engine</w:t>
+      </w:r>
+    </w:p>
+    <w:p>
+      <w:r>
+        <w:t xml:space="preserve">Every retainer client gets a QBR structured as: Results (what we did and what it produced, KPI deltas versus targets), then Insights (what the data is telling us — the part they cannot get elsewhere), then Maturity check (re-score them on the lifecycle map), then Roadmap (the next one to two phases and the projects that unlock them), then Proposal (a concrete, costed next step). No QBR should end without a confirmed continuation and a proposed expansion.</w:t>
+      </w:r>
+    </w:p>
+    <w:p>
+      <w:pPr>
+        <w:pStyle w:val="Heading2"/>
+      </w:pPr>
+      <w:r>
+        <w:t xml:space="preserve">Churn early-warning system</w:t>
       </w:r>
     </w:p>
     <w:tbl>
@@ -9404,6 +9018,775 @@
               <w:rPr>
                 <w:b/>
               </w:rPr>
+              <w:t xml:space="preserve">Signal</w:t>
+            </w:r>
+          </w:p>
+        </w:tc>
+        <w:tc>
+          <w:tcPr>
+            <w:tcW w:w="3120" w:type="dxa"/>
+            <w:shd w:val="clear" w:color="auto" w:fill="D9E2F3"/>
+          </w:tcPr>
+          <w:p>
+            <w:pPr>
+              <w:spacing w:after="0"/>
+            </w:pPr>
+            <w:r>
+              <w:rPr>
+                <w:b/>
+              </w:rPr>
+              <w:t xml:space="preserve">Risk</w:t>
+            </w:r>
+          </w:p>
+        </w:tc>
+        <w:tc>
+          <w:tcPr>
+            <w:tcW w:w="3120" w:type="dxa"/>
+            <w:shd w:val="clear" w:color="auto" w:fill="D9E2F3"/>
+          </w:tcPr>
+          <w:p>
+            <w:pPr>
+              <w:spacing w:after="0"/>
+            </w:pPr>
+            <w:r>
+              <w:rPr>
+                <w:b/>
+              </w:rPr>
+              <w:t xml:space="preserve">Play</w:t>
+            </w:r>
+          </w:p>
+        </w:tc>
+      </w:tr>
+      <w:tr>
+        <w:tc>
+          <w:tcPr>
+            <w:tcW w:w="3120" w:type="dxa"/>
+          </w:tcPr>
+          <w:p>
+            <w:pPr>
+              <w:spacing w:after="0"/>
+            </w:pPr>
+            <w:r>
+              <w:t xml:space="preserve">Falling engagement (slow replies, skipped QBRs)</w:t>
+            </w:r>
+          </w:p>
+        </w:tc>
+        <w:tc>
+          <w:tcPr>
+            <w:tcW w:w="3120" w:type="dxa"/>
+          </w:tcPr>
+          <w:p>
+            <w:pPr>
+              <w:spacing w:after="0"/>
+            </w:pPr>
+            <w:r>
+              <w:t xml:space="preserve">High</w:t>
+            </w:r>
+          </w:p>
+        </w:tc>
+        <w:tc>
+          <w:tcPr>
+            <w:tcW w:w="3120" w:type="dxa"/>
+          </w:tcPr>
+          <w:p>
+            <w:pPr>
+              <w:spacing w:after="0"/>
+            </w:pPr>
+            <w:r>
+              <w:t xml:space="preserve">Executive check-in, re-establish value</w:t>
+            </w:r>
+          </w:p>
+        </w:tc>
+      </w:tr>
+      <w:tr>
+        <w:tc>
+          <w:tcPr>
+            <w:tcW w:w="3120" w:type="dxa"/>
+          </w:tcPr>
+          <w:p>
+            <w:pPr>
+              <w:spacing w:after="0"/>
+            </w:pPr>
+            <w:r>
+              <w:t xml:space="preserve">Flat or negative KPIs</w:t>
+            </w:r>
+          </w:p>
+        </w:tc>
+        <w:tc>
+          <w:tcPr>
+            <w:tcW w:w="3120" w:type="dxa"/>
+          </w:tcPr>
+          <w:p>
+            <w:pPr>
+              <w:spacing w:after="0"/>
+            </w:pPr>
+            <w:r>
+              <w:t xml:space="preserve">High</w:t>
+            </w:r>
+          </w:p>
+        </w:tc>
+        <w:tc>
+          <w:tcPr>
+            <w:tcW w:w="3120" w:type="dxa"/>
+          </w:tcPr>
+          <w:p>
+            <w:pPr>
+              <w:spacing w:after="0"/>
+            </w:pPr>
+            <w:r>
+              <w:t xml:space="preserve">Diagnostic plus reset plan before they ask</w:t>
+            </w:r>
+          </w:p>
+        </w:tc>
+      </w:tr>
+      <w:tr>
+        <w:tc>
+          <w:tcPr>
+            <w:tcW w:w="3120" w:type="dxa"/>
+          </w:tcPr>
+          <w:p>
+            <w:pPr>
+              <w:spacing w:after="0"/>
+            </w:pPr>
+            <w:r>
+              <w:t xml:space="preserve">Single point of contact leaves</w:t>
+            </w:r>
+          </w:p>
+        </w:tc>
+        <w:tc>
+          <w:tcPr>
+            <w:tcW w:w="3120" w:type="dxa"/>
+          </w:tcPr>
+          <w:p>
+            <w:pPr>
+              <w:spacing w:after="0"/>
+            </w:pPr>
+            <w:r>
+              <w:t xml:space="preserve">High</w:t>
+            </w:r>
+          </w:p>
+        </w:tc>
+        <w:tc>
+          <w:tcPr>
+            <w:tcW w:w="3120" w:type="dxa"/>
+          </w:tcPr>
+          <w:p>
+            <w:pPr>
+              <w:spacing w:after="0"/>
+            </w:pPr>
+            <w:r>
+              <w:t xml:space="preserve">Multi-thread the relationship fast</w:t>
+            </w:r>
+          </w:p>
+        </w:tc>
+      </w:tr>
+      <w:tr>
+        <w:tc>
+          <w:tcPr>
+            <w:tcW w:w="3120" w:type="dxa"/>
+          </w:tcPr>
+          <w:p>
+            <w:pPr>
+              <w:spacing w:after="0"/>
+            </w:pPr>
+            <w:r>
+              <w:t xml:space="preserve">Scope shrinking</w:t>
+            </w:r>
+          </w:p>
+        </w:tc>
+        <w:tc>
+          <w:tcPr>
+            <w:tcW w:w="3120" w:type="dxa"/>
+          </w:tcPr>
+          <w:p>
+            <w:pPr>
+              <w:spacing w:after="0"/>
+            </w:pPr>
+            <w:r>
+              <w:t xml:space="preserve">Medium</w:t>
+            </w:r>
+          </w:p>
+        </w:tc>
+        <w:tc>
+          <w:tcPr>
+            <w:tcW w:w="3120" w:type="dxa"/>
+          </w:tcPr>
+          <w:p>
+            <w:pPr>
+              <w:spacing w:after="0"/>
+            </w:pPr>
+            <w:r>
+              <w:t xml:space="preserve">Re-discover needs; re-map maturity</w:t>
+            </w:r>
+          </w:p>
+        </w:tc>
+      </w:tr>
+      <w:tr>
+        <w:tc>
+          <w:tcPr>
+            <w:tcW w:w="3120" w:type="dxa"/>
+          </w:tcPr>
+          <w:p>
+            <w:pPr>
+              <w:spacing w:after="0"/>
+            </w:pPr>
+            <w:r>
+              <w:t xml:space="preserve">Price sensitivity / discount requests</w:t>
+            </w:r>
+          </w:p>
+        </w:tc>
+        <w:tc>
+          <w:tcPr>
+            <w:tcW w:w="3120" w:type="dxa"/>
+          </w:tcPr>
+          <w:p>
+            <w:pPr>
+              <w:spacing w:after="0"/>
+            </w:pPr>
+            <w:r>
+              <w:t xml:space="preserve">Medium</w:t>
+            </w:r>
+          </w:p>
+        </w:tc>
+        <w:tc>
+          <w:tcPr>
+            <w:tcW w:w="3120" w:type="dxa"/>
+          </w:tcPr>
+          <w:p>
+            <w:pPr>
+              <w:spacing w:after="0"/>
+            </w:pPr>
+            <w:r>
+              <w:t xml:space="preserve">Re-anchor on ROI and outcomes</w:t>
+            </w:r>
+          </w:p>
+        </w:tc>
+      </w:tr>
+      <w:tr>
+        <w:tc>
+          <w:tcPr>
+            <w:tcW w:w="3120" w:type="dxa"/>
+          </w:tcPr>
+          <w:p>
+            <w:pPr>
+              <w:spacing w:after="0"/>
+            </w:pPr>
+            <w:r>
+              <w:t xml:space="preserve">Going quiet near renewal</w:t>
+            </w:r>
+          </w:p>
+        </w:tc>
+        <w:tc>
+          <w:tcPr>
+            <w:tcW w:w="3120" w:type="dxa"/>
+          </w:tcPr>
+          <w:p>
+            <w:pPr>
+              <w:spacing w:after="0"/>
+            </w:pPr>
+            <w:r>
+              <w:t xml:space="preserve">High</w:t>
+            </w:r>
+          </w:p>
+        </w:tc>
+        <w:tc>
+          <w:tcPr>
+            <w:tcW w:w="3120" w:type="dxa"/>
+          </w:tcPr>
+          <w:p>
+            <w:pPr>
+              <w:spacing w:after="0"/>
+            </w:pPr>
+            <w:r>
+              <w:t xml:space="preserve">Proactive renewal conversation 60+ days out</w:t>
+            </w:r>
+          </w:p>
+        </w:tc>
+      </w:tr>
+    </w:tbl>
+    <w:p/>
+    <w:p>
+      <w:pPr>
+        <w:pStyle w:val="Heading2"/>
+      </w:pPr>
+      <w:r>
+        <w:t xml:space="preserve">Helping clients retain their customers (the Phase 5 service)</w:t>
+      </w:r>
+    </w:p>
+    <w:p>
+      <w:r>
+        <w:t xml:space="preserve">This is what we sell, and it mirrors our own model. The customer value retention loop runs: Acquire, then Onboard (first value fast), then Engage (lifecycle comms), then Reward (loyalty), then Advocate (referrals/reviews), and back to Acquire — with a Recover (win-back) path whenever engagement signals risk.</w:t>
+      </w:r>
+    </w:p>
+    <w:tbl>
+      <w:tblPr>
+        <w:tblW w:w="9360" w:type="dxa"/>
+        <w:tblLayout w:type="fixed"/>
+        <w:tblBorders>
+          <w:top w:val="single" w:sz="4" w:space="0" w:color="BFBFBF"/>
+          <w:left w:val="single" w:sz="4" w:space="0" w:color="BFBFBF"/>
+          <w:bottom w:val="single" w:sz="4" w:space="0" w:color="BFBFBF"/>
+          <w:right w:val="single" w:sz="4" w:space="0" w:color="BFBFBF"/>
+          <w:insideH w:val="single" w:sz="4" w:space="0" w:color="BFBFBF"/>
+          <w:insideV w:val="single" w:sz="4" w:space="0" w:color="BFBFBF"/>
+        </w:tblBorders>
+        <w:tblLook w:val="04A0" w:firstRow="1" w:lastRow="0" w:firstColumn="0" w:lastColumn="0" w:noHBand="0" w:noVBand="1"/>
+      </w:tblPr>
+      <w:tblGrid>
+        <w:gridCol w:w="3120"/>
+        <w:gridCol w:w="3120"/>
+        <w:gridCol w:w="3120"/>
+      </w:tblGrid>
+      <w:tr>
+        <w:tc>
+          <w:tcPr>
+            <w:tcW w:w="3120" w:type="dxa"/>
+            <w:shd w:val="clear" w:color="auto" w:fill="D9E2F3"/>
+          </w:tcPr>
+          <w:p>
+            <w:pPr>
+              <w:spacing w:after="0"/>
+            </w:pPr>
+            <w:r>
+              <w:rPr>
+                <w:b/>
+              </w:rPr>
+              <w:t xml:space="preserve">Lever</w:t>
+            </w:r>
+          </w:p>
+        </w:tc>
+        <w:tc>
+          <w:tcPr>
+            <w:tcW w:w="3120" w:type="dxa"/>
+            <w:shd w:val="clear" w:color="auto" w:fill="D9E2F3"/>
+          </w:tcPr>
+          <w:p>
+            <w:pPr>
+              <w:spacing w:after="0"/>
+            </w:pPr>
+            <w:r>
+              <w:rPr>
+                <w:b/>
+              </w:rPr>
+              <w:t xml:space="preserve">Tools / tactics</w:t>
+            </w:r>
+          </w:p>
+        </w:tc>
+        <w:tc>
+          <w:tcPr>
+            <w:tcW w:w="3120" w:type="dxa"/>
+            <w:shd w:val="clear" w:color="auto" w:fill="D9E2F3"/>
+          </w:tcPr>
+          <w:p>
+            <w:pPr>
+              <w:spacing w:after="0"/>
+            </w:pPr>
+            <w:r>
+              <w:rPr>
+                <w:b/>
+              </w:rPr>
+              <w:t xml:space="preserve">Service line</w:t>
+            </w:r>
+          </w:p>
+        </w:tc>
+      </w:tr>
+      <w:tr>
+        <w:tc>
+          <w:tcPr>
+            <w:tcW w:w="3120" w:type="dxa"/>
+          </w:tcPr>
+          <w:p>
+            <w:pPr>
+              <w:spacing w:after="0"/>
+            </w:pPr>
+            <w:r>
+              <w:t xml:space="preserve">Onboarding</w:t>
+            </w:r>
+          </w:p>
+        </w:tc>
+        <w:tc>
+          <w:tcPr>
+            <w:tcW w:w="3120" w:type="dxa"/>
+          </w:tcPr>
+          <w:p>
+            <w:pPr>
+              <w:spacing w:after="0"/>
+            </w:pPr>
+            <w:r>
+              <w:t xml:space="preserve">Welcome flows, setup help, first-value milestones</w:t>
+            </w:r>
+          </w:p>
+        </w:tc>
+        <w:tc>
+          <w:tcPr>
+            <w:tcW w:w="3120" w:type="dxa"/>
+          </w:tcPr>
+          <w:p>
+            <w:pPr>
+              <w:spacing w:after="0"/>
+            </w:pPr>
+            <w:r>
+              <w:t xml:space="preserve">CX + Automation</w:t>
+            </w:r>
+          </w:p>
+        </w:tc>
+      </w:tr>
+      <w:tr>
+        <w:tc>
+          <w:tcPr>
+            <w:tcW w:w="3120" w:type="dxa"/>
+          </w:tcPr>
+          <w:p>
+            <w:pPr>
+              <w:spacing w:after="0"/>
+            </w:pPr>
+            <w:r>
+              <w:t xml:space="preserve">Lifecycle marketing</w:t>
+            </w:r>
+          </w:p>
+        </w:tc>
+        <w:tc>
+          <w:tcPr>
+            <w:tcW w:w="3120" w:type="dxa"/>
+          </w:tcPr>
+          <w:p>
+            <w:pPr>
+              <w:spacing w:after="0"/>
+            </w:pPr>
+            <w:r>
+              <w:t xml:space="preserve">Segmented email/SMS, triggered campaigns</w:t>
+            </w:r>
+          </w:p>
+        </w:tc>
+        <w:tc>
+          <w:tcPr>
+            <w:tcW w:w="3120" w:type="dxa"/>
+          </w:tcPr>
+          <w:p>
+            <w:pPr>
+              <w:spacing w:after="0"/>
+            </w:pPr>
+            <w:r>
+              <w:t xml:space="preserve">Marketing + Automation</w:t>
+            </w:r>
+          </w:p>
+        </w:tc>
+      </w:tr>
+      <w:tr>
+        <w:tc>
+          <w:tcPr>
+            <w:tcW w:w="3120" w:type="dxa"/>
+          </w:tcPr>
+          <w:p>
+            <w:pPr>
+              <w:spacing w:after="0"/>
+            </w:pPr>
+            <w:r>
+              <w:t xml:space="preserve">Loyalty &amp; rewards</w:t>
+            </w:r>
+          </w:p>
+        </w:tc>
+        <w:tc>
+          <w:tcPr>
+            <w:tcW w:w="3120" w:type="dxa"/>
+          </w:tcPr>
+          <w:p>
+            <w:pPr>
+              <w:spacing w:after="0"/>
+            </w:pPr>
+            <w:r>
+              <w:t xml:space="preserve">Points, tiers, referrals, VIP perks</w:t>
+            </w:r>
+          </w:p>
+        </w:tc>
+        <w:tc>
+          <w:tcPr>
+            <w:tcW w:w="3120" w:type="dxa"/>
+          </w:tcPr>
+          <w:p>
+            <w:pPr>
+              <w:spacing w:after="0"/>
+            </w:pPr>
+            <w:r>
+              <w:t xml:space="preserve">CX + Marketing</w:t>
+            </w:r>
+          </w:p>
+        </w:tc>
+      </w:tr>
+      <w:tr>
+        <w:tc>
+          <w:tcPr>
+            <w:tcW w:w="3120" w:type="dxa"/>
+          </w:tcPr>
+          <w:p>
+            <w:pPr>
+              <w:spacing w:after="0"/>
+            </w:pPr>
+            <w:r>
+              <w:t xml:space="preserve">Support excellence</w:t>
+            </w:r>
+          </w:p>
+        </w:tc>
+        <w:tc>
+          <w:tcPr>
+            <w:tcW w:w="3120" w:type="dxa"/>
+          </w:tcPr>
+          <w:p>
+            <w:pPr>
+              <w:spacing w:after="0"/>
+            </w:pPr>
+            <w:r>
+              <w:t xml:space="preserve">Helpdesk, chatbot, SLAs, omnichannel</w:t>
+            </w:r>
+          </w:p>
+        </w:tc>
+        <w:tc>
+          <w:tcPr>
+            <w:tcW w:w="3120" w:type="dxa"/>
+          </w:tcPr>
+          <w:p>
+            <w:pPr>
+              <w:spacing w:after="0"/>
+            </w:pPr>
+            <w:r>
+              <w:t xml:space="preserve">CX + Tech</w:t>
+            </w:r>
+          </w:p>
+        </w:tc>
+      </w:tr>
+      <w:tr>
+        <w:tc>
+          <w:tcPr>
+            <w:tcW w:w="3120" w:type="dxa"/>
+          </w:tcPr>
+          <w:p>
+            <w:pPr>
+              <w:spacing w:after="0"/>
+            </w:pPr>
+            <w:r>
+              <w:t xml:space="preserve">Reputation</w:t>
+            </w:r>
+          </w:p>
+        </w:tc>
+        <w:tc>
+          <w:tcPr>
+            <w:tcW w:w="3120" w:type="dxa"/>
+          </w:tcPr>
+          <w:p>
+            <w:pPr>
+              <w:spacing w:after="0"/>
+            </w:pPr>
+            <w:r>
+              <w:t xml:space="preserve">Review generation and management</w:t>
+            </w:r>
+          </w:p>
+        </w:tc>
+        <w:tc>
+          <w:tcPr>
+            <w:tcW w:w="3120" w:type="dxa"/>
+          </w:tcPr>
+          <w:p>
+            <w:pPr>
+              <w:spacing w:after="0"/>
+            </w:pPr>
+            <w:r>
+              <w:t xml:space="preserve">Branding + Marketing</w:t>
+            </w:r>
+          </w:p>
+        </w:tc>
+      </w:tr>
+      <w:tr>
+        <w:tc>
+          <w:tcPr>
+            <w:tcW w:w="3120" w:type="dxa"/>
+          </w:tcPr>
+          <w:p>
+            <w:pPr>
+              <w:spacing w:after="0"/>
+            </w:pPr>
+            <w:r>
+              <w:t xml:space="preserve">Win-back</w:t>
+            </w:r>
+          </w:p>
+        </w:tc>
+        <w:tc>
+          <w:tcPr>
+            <w:tcW w:w="3120" w:type="dxa"/>
+          </w:tcPr>
+          <w:p>
+            <w:pPr>
+              <w:spacing w:after="0"/>
+            </w:pPr>
+            <w:r>
+              <w:t xml:space="preserve">Churn prediction plus reactivation offers</w:t>
+            </w:r>
+          </w:p>
+        </w:tc>
+        <w:tc>
+          <w:tcPr>
+            <w:tcW w:w="3120" w:type="dxa"/>
+          </w:tcPr>
+          <w:p>
+            <w:pPr>
+              <w:spacing w:after="0"/>
+            </w:pPr>
+            <w:r>
+              <w:t xml:space="preserve">Data + Marketing</w:t>
+            </w:r>
+          </w:p>
+        </w:tc>
+      </w:tr>
+      <w:tr>
+        <w:tc>
+          <w:tcPr>
+            <w:tcW w:w="3120" w:type="dxa"/>
+          </w:tcPr>
+          <w:p>
+            <w:pPr>
+              <w:spacing w:after="0"/>
+            </w:pPr>
+            <w:r>
+              <w:t xml:space="preserve">Community</w:t>
+            </w:r>
+          </w:p>
+        </w:tc>
+        <w:tc>
+          <w:tcPr>
+            <w:tcW w:w="3120" w:type="dxa"/>
+          </w:tcPr>
+          <w:p>
+            <w:pPr>
+              <w:spacing w:after="0"/>
+            </w:pPr>
+            <w:r>
+              <w:t xml:space="preserve">Online community, groups, webinars, content, advocacy</w:t>
+            </w:r>
+          </w:p>
+        </w:tc>
+        <w:tc>
+          <w:tcPr>
+            <w:tcW w:w="3120" w:type="dxa"/>
+          </w:tcPr>
+          <w:p>
+            <w:pPr>
+              <w:spacing w:after="0"/>
+            </w:pPr>
+            <w:r>
+              <w:t xml:space="preserve">Branding + Marketing</w:t>
+            </w:r>
+          </w:p>
+        </w:tc>
+      </w:tr>
+    </w:tbl>
+    <w:p/>
+    <w:p>
+      <w:r>
+        <w:t xml:space="preserve">The mirror principle: we sell retention because we practice retention. The same loop — deliver value, prove it, deepen the relationship, expand — runs at both levels. Retention is both our service and our business model.</w:t>
+      </w:r>
+    </w:p>
+    <w:p>
+      <w:pPr>
+        <w:pStyle w:val="Heading1"/>
+      </w:pPr>
+      <w:r>
+        <w:t xml:space="preserve">Part 8 — Internal Team Structure by Phase</w:t>
+      </w:r>
+    </w:p>
+    <w:p>
+      <w:r>
+        <w:t xml:space="preserve">A 360° firm needs an org design that delivers a single relationship to the client while keeping deep specialist capability inside. The answer is a pod plus practice matrix: client-facing pods own the relationship; specialist practices own the craft.</w:t>
+      </w:r>
+    </w:p>
+    <w:p>
+      <w:pPr>
+        <w:pStyle w:val="Heading2"/>
+      </w:pPr>
+      <w:r>
+        <w:t xml:space="preserve">The operating model: pods x practices</w:t>
+      </w:r>
+    </w:p>
+    <w:p>
+      <w:pPr>
+        <w:numPr>
+          <w:ilvl w:val="0"/>
+          <w:numId w:val="1"/>
+        </w:numPr>
+        <w:spacing w:after="60"/>
+      </w:pPr>
+      <w:r>
+        <w:t xml:space="preserve">Pods are cross-functional, client-facing teams led by a Growth Partner Lead. They own the client roadmap, retention, and results across all phases.</w:t>
+      </w:r>
+    </w:p>
+    <w:p>
+      <w:pPr>
+        <w:numPr>
+          <w:ilvl w:val="0"/>
+          <w:numId w:val="1"/>
+        </w:numPr>
+        <w:spacing w:after="60"/>
+      </w:pPr>
+      <w:r>
+        <w:t xml:space="preserve">Practices are the centers of excellence (Strategy; Brand &amp; Creative; Web &amp; Tech; Marketing; Sales/CRM; CX &amp; Ops; Data &amp; AI; Finance &amp; Legal). Specialists live in a practice for craft, standards, and career growth, and are deployed into pods.</w:t>
+      </w:r>
+    </w:p>
+    <w:p>
+      <w:pPr>
+        <w:numPr>
+          <w:ilvl w:val="0"/>
+          <w:numId w:val="1"/>
+        </w:numPr>
+        <w:spacing w:after="60"/>
+      </w:pPr>
+      <w:r>
+        <w:t xml:space="preserve">Shared services (RevOps/PMO, Talent/L&amp;D, Finance/Admin) keep the firm running.</w:t>
+      </w:r>
+    </w:p>
+    <w:p>
+      <w:r>
+        <w:t xml:space="preserve">This is how firms stay integrated and deep: the client feels one team (the pod), while quality is guaranteed by the practices behind it.</w:t>
+      </w:r>
+    </w:p>
+    <w:p>
+      <w:pPr>
+        <w:pStyle w:val="Heading2"/>
+      </w:pPr>
+      <w:r>
+        <w:t xml:space="preserve">Core roles</w:t>
+      </w:r>
+    </w:p>
+    <w:tbl>
+      <w:tblPr>
+        <w:tblW w:w="9360" w:type="dxa"/>
+        <w:tblLayout w:type="fixed"/>
+        <w:tblBorders>
+          <w:top w:val="single" w:sz="4" w:space="0" w:color="BFBFBF"/>
+          <w:left w:val="single" w:sz="4" w:space="0" w:color="BFBFBF"/>
+          <w:bottom w:val="single" w:sz="4" w:space="0" w:color="BFBFBF"/>
+          <w:right w:val="single" w:sz="4" w:space="0" w:color="BFBFBF"/>
+          <w:insideH w:val="single" w:sz="4" w:space="0" w:color="BFBFBF"/>
+          <w:insideV w:val="single" w:sz="4" w:space="0" w:color="BFBFBF"/>
+        </w:tblBorders>
+        <w:tblLook w:val="04A0" w:firstRow="1" w:lastRow="0" w:firstColumn="0" w:lastColumn="0" w:noHBand="0" w:noVBand="1"/>
+      </w:tblPr>
+      <w:tblGrid>
+        <w:gridCol w:w="3120"/>
+        <w:gridCol w:w="3120"/>
+        <w:gridCol w:w="3120"/>
+      </w:tblGrid>
+      <w:tr>
+        <w:tc>
+          <w:tcPr>
+            <w:tcW w:w="3120" w:type="dxa"/>
+            <w:shd w:val="clear" w:color="auto" w:fill="D9E2F3"/>
+          </w:tcPr>
+          <w:p>
+            <w:pPr>
+              <w:spacing w:after="0"/>
+            </w:pPr>
+            <w:r>
+              <w:rPr>
+                <w:b/>
+              </w:rPr>
               <w:t xml:space="preserve">Role</w:t>
             </w:r>
           </w:p>
@@ -9671,7 +10054,7 @@
               <w:spacing w:after="0"/>
             </w:pPr>
             <w:r>
-              <w:t xml:space="preserve">SEO, paid, content, social, offline</w:t>
+              <w:t xml:space="preserve">SEO, paid, content, social, email</w:t>
             </w:r>
           </w:p>
         </w:tc>
@@ -11043,7 +11426,7 @@
               <w:spacing w:after="0"/>
             </w:pPr>
             <w:r>
-              <w:t xml:space="preserve">"Set up GA4", "Configure CRM pipeline", "QR campaign setup"</w:t>
+              <w:t xml:space="preserve">"Set up GA4", "Configure CRM pipeline", "Build a retargeting audience"</w:t>
             </w:r>
           </w:p>
         </w:tc>
@@ -11693,7 +12076,7 @@
               <w:spacing w:after="0"/>
             </w:pPr>
             <w:r>
-              <w:t xml:space="preserve">Cost to acquire a customer (blended online plus offline)</w:t>
+              <w:t xml:space="preserve">Cost to acquire a customer (blended across digital channels)</w:t>
             </w:r>
           </w:p>
         </w:tc>
@@ -12469,7 +12852,7 @@
     </w:p>
     <w:p>
       <w:r>
-        <w:t xml:space="preserve">Three dashboards read from one data layer/warehouse fed by web/analytics, ad platforms, CRM/sales, support/CX, finance, and offline sources (codes/QR/loyalty): the Client dashboard (outcomes, ROI, funnel, retention — the proof), the Internal Ops dashboard (delivery health, KPIs by channel, utilization), and the Exec dashboard (MRR/ARR, NRR, margin, pipeline). Offline gets its own data source line on purpose so online plus offline live in one funnel. Reporting cadence: real-time/daily (spend, pacing, anomalies, outages for delivery teams); weekly (channel performance and optimizations for pod plus client lead); monthly (outcome KPIs versus targets for client plus pod); quarterly QBR (results, insights, maturity, roadmap for client execs); quarterly internal (firm KPIs, margins, retention for leadership).</w:t>
+        <w:t xml:space="preserve">Three dashboards read from one data layer/warehouse fed by web/analytics, ad platforms, CRM/sales, support/CX, finance, and marketplace/affiliate sources: the Client dashboard (outcomes, ROI, funnel, retention — the proof), the Internal Ops dashboard (delivery health, KPIs by channel, utilization), and the Exec dashboard (MRR/ARR, NRR, margin, pipeline). Every channel flows into the same warehouse so all digital channels live in one funnel. Reporting cadence: real-time/daily (spend, pacing, anomalies, outages for delivery teams); weekly (channel performance and optimizations for pod plus client lead); monthly (outcome KPIs versus targets for client plus pod); quarterly QBR (results, insights, maturity, roadmap for client execs); quarterly internal (firm KPIs, margins, retention for leadership).</w:t>
       </w:r>
     </w:p>
     <w:p>
@@ -13091,7 +13474,7 @@
     </w:p>
     <w:p>
       <w:r>
-        <w:t xml:space="preserve">First 90 days — build the spine: stand up the data core (one CRM plus analytics warehouse); document the foundational SOPs (onboarding, handoff, reporting, QBR); define the KPI tree plus dashboards; map current clients on the maturity model to find cross-sell; adopt roadmap-first selling. Months 4 to 12 — turn the flywheel: form pods plus practices and assign Growth Partner Leads; productize the top offers per phase and set packaging tiers; launch the QBR engine for all retainer clients; build the partner network; automate onboarding, reporting, and nurture; instrument online plus offline into one funnel; review firm KPIs quarterly.</w:t>
+        <w:t xml:space="preserve">First 90 days — build the spine: stand up the data core (one CRM plus analytics warehouse); document the foundational SOPs (onboarding, handoff, reporting, QBR); define the KPI tree plus dashboards; map current clients on the maturity model to find cross-sell; adopt roadmap-first selling. Months 4 to 12 — turn the flywheel: form pods plus practices and assign Growth Partner Leads; productize the top offers per phase and set packaging tiers; launch the QBR engine for all retainer clients; build the partner network; automate onboarding, reporting, and nurture; instrument every digital channel into one funnel; review firm KPIs quarterly.</w:t>
       </w:r>
     </w:p>
     <w:p>
@@ -13396,7 +13779,7 @@
     </w:p>
     <w:p>
       <w:r>
-        <w:t xml:space="preserve">"We are not a service provider you hire for a task — we are the growth partner who maps your entire business journey, connects every capability you need across online and offline, and stays with you from idea to enterprise." The promises that back it up: one relationship, every capability; connected, not bundled; proven, not promised (one dashboard ties our work to your revenue); online plus offline, one strategy; and we grow when you grow.</w:t>
+        <w:t xml:space="preserve">"We are not a service provider you hire for a task — we are the digital growth partner who maps your entire business journey, connects every digital capability you need, and stays with you from idea to enterprise." The promises that back it up: one relationship, every capability; connected, not bundled; proven, not promised (one dashboard ties our work to your revenue); every channel, one strategy; and we grow when you grow.</w:t>
       </w:r>
     </w:p>
     <w:p>

</xml_diff>